<commit_message>
fix(api): place real template placeholders in contract bodies
</commit_message>
<xml_diff>
--- a/services/api/assets/templates/labor-subcontract-real-v1.docx
+++ b/services/api/assets/templates/labor-subcontract-real-v1.docx
@@ -5,385 +5,6 @@
   <w:body>
     <w:p>
       <w:pPr>
-        <w:jc w:val="center"/>
-      </w:pPr>
-      <w:r>
-        <w:t xml:space="preserve">{document.watermark}</w:t>
-      </w:r>
-    </w:p>
-    <w:p>
-      <w:pPr>
-        <w:jc w:val="center"/>
-      </w:pPr>
-      <w:r>
-        <w:rPr>
-          <w:b/>
-          <w:sz w:val="28"/>
-          <w:szCs w:val="28"/>
-        </w:rPr>
-        <w:t xml:space="preserve">合同工作台填写区</w:t>
-      </w:r>
-    </w:p>
-    <w:tbl>
-      <w:tblPr>
-        <w:tblW w:w="0" w:type="auto"/>
-        <w:tblBorders>
-          <w:top w:val="single" w:sz="4" w:space="0" w:color="000000"/>
-          <w:left w:val="single" w:sz="4" w:space="0" w:color="000000"/>
-          <w:bottom w:val="single" w:sz="4" w:space="0" w:color="000000"/>
-          <w:right w:val="single" w:sz="4" w:space="0" w:color="000000"/>
-          <w:insideH w:val="single" w:sz="4" w:space="0" w:color="000000"/>
-          <w:insideV w:val="single" w:sz="4" w:space="0" w:color="000000"/>
-        </w:tblBorders>
-      </w:tblPr>
-      <w:tr>
-        <w:tc>
-          <w:tcPr>
-            <w:tcW w:w="2400" w:type="dxa"/>
-          </w:tcPr>
-          <w:p>
-            <w:r>
-              <w:t xml:space="preserve">合同名称</w:t>
-            </w:r>
-          </w:p>
-        </w:tc>
-        <w:tc>
-          <w:tcPr>
-            <w:tcW w:w="2400" w:type="dxa"/>
-          </w:tcPr>
-          <w:p>
-            <w:r>
-              <w:t xml:space="preserve">{contract.name}</w:t>
-            </w:r>
-          </w:p>
-        </w:tc>
-        <w:tc>
-          <w:tcPr>
-            <w:tcW w:w="2400" w:type="dxa"/>
-          </w:tcPr>
-          <w:p>
-            <w:r>
-              <w:t xml:space="preserve">临时编号</w:t>
-            </w:r>
-          </w:p>
-        </w:tc>
-        <w:tc>
-          <w:tcPr>
-            <w:tcW w:w="2400" w:type="dxa"/>
-          </w:tcPr>
-          <w:p>
-            <w:r>
-              <w:t xml:space="preserve">{contract.temporaryCode}</w:t>
-            </w:r>
-          </w:p>
-        </w:tc>
-      </w:tr>
-      <w:tr>
-        <w:tc>
-          <w:tcPr>
-            <w:tcW w:w="2400" w:type="dxa"/>
-          </w:tcPr>
-          <w:p>
-            <w:r>
-              <w:t xml:space="preserve">合同金额大写</w:t>
-            </w:r>
-          </w:p>
-        </w:tc>
-        <w:tc>
-          <w:tcPr>
-            <w:tcW w:w="2400" w:type="dxa"/>
-          </w:tcPr>
-          <w:p>
-            <w:r>
-              <w:t xml:space="preserve">{contract.amountUppercase}</w:t>
-            </w:r>
-          </w:p>
-        </w:tc>
-        <w:tc>
-          <w:tcPr>
-            <w:tcW w:w="2400" w:type="dxa"/>
-          </w:tcPr>
-          <w:p>
-            <w:r>
-              <w:t xml:space="preserve">作业地点</w:t>
-            </w:r>
-          </w:p>
-        </w:tc>
-        <w:tc>
-          <w:tcPr>
-            <w:tcW w:w="2400" w:type="dxa"/>
-          </w:tcPr>
-          <w:p>
-            <w:r>
-              <w:t xml:space="preserve">{field.workLocation}</w:t>
-            </w:r>
-          </w:p>
-        </w:tc>
-      </w:tr>
-      <w:tr>
-        <w:tc>
-          <w:tcPr>
-            <w:tcW w:w="2400" w:type="dxa"/>
-          </w:tcPr>
-          <w:p>
-            <w:r>
-              <w:t xml:space="preserve">计划开始日期</w:t>
-            </w:r>
-          </w:p>
-        </w:tc>
-        <w:tc>
-          <w:tcPr>
-            <w:tcW w:w="2400" w:type="dxa"/>
-          </w:tcPr>
-          <w:p>
-            <w:r>
-              <w:t xml:space="preserve">{field.plannedStartDate}</w:t>
-            </w:r>
-          </w:p>
-        </w:tc>
-        <w:tc>
-          <w:tcPr>
-            <w:tcW w:w="2400" w:type="dxa"/>
-          </w:tcPr>
-          <w:p>
-            <w:r>
-              <w:t xml:space="preserve">计划结束日期</w:t>
-            </w:r>
-          </w:p>
-        </w:tc>
-        <w:tc>
-          <w:tcPr>
-            <w:tcW w:w="2400" w:type="dxa"/>
-          </w:tcPr>
-          <w:p>
-            <w:r>
-              <w:t xml:space="preserve">{field.plannedEndDate}</w:t>
-            </w:r>
-          </w:p>
-        </w:tc>
-      </w:tr>
-      <w:tr>
-        <w:tc>
-          <w:tcPr>
-            <w:tcW w:w="2400" w:type="dxa"/>
-          </w:tcPr>
-          <w:p>
-            <w:r>
-              <w:t xml:space="preserve">结算周期</w:t>
-            </w:r>
-          </w:p>
-        </w:tc>
-        <w:tc>
-          <w:tcPr>
-            <w:tcW w:w="2400" w:type="dxa"/>
-          </w:tcPr>
-          <w:p>
-            <w:r>
-              <w:t xml:space="preserve">{field.settlementCycle}</w:t>
-            </w:r>
-          </w:p>
-        </w:tc>
-        <w:tc>
-          <w:tcPr>
-            <w:tcW w:w="2400" w:type="dxa"/>
-          </w:tcPr>
-          <w:p>
-            <w:r>
-              <w:t xml:space="preserve">进度款比例(%)</w:t>
-            </w:r>
-          </w:p>
-        </w:tc>
-        <w:tc>
-          <w:tcPr>
-            <w:tcW w:w="2400" w:type="dxa"/>
-          </w:tcPr>
-          <w:p>
-            <w:r>
-              <w:t xml:space="preserve">{field.progressPaymentRatioPercent}</w:t>
-            </w:r>
-          </w:p>
-        </w:tc>
-      </w:tr>
-    </w:tbl>
-    <w:p>
-      <w:r>
-        <w:t xml:space="preserve">劳务范围：{field.workScope}</w:t>
-      </w:r>
-    </w:p>
-    <w:p>
-      <w:r>
-        <w:t xml:space="preserve">付款条款：{clause.payment.text}</w:t>
-      </w:r>
-    </w:p>
-    <w:p>
-      <w:r>
-        <w:t xml:space="preserve">安全协议：{clause.safety.text}</w:t>
-      </w:r>
-    </w:p>
-    <w:p>
-      <w:r>
-        <w:t xml:space="preserve">农民工工资承诺：{clause.wageCommitment.text}</w:t>
-      </w:r>
-    </w:p>
-    <w:p>
-      <w:r>
-        <w:t xml:space="preserve">劳务清单：</w:t>
-      </w:r>
-    </w:p>
-    <w:p>
-      <w:r>
-        <w:t xml:space="preserve">{#bill.laborItems}</w:t>
-      </w:r>
-    </w:p>
-    <w:tbl>
-      <w:tblPr>
-        <w:tblW w:w="0" w:type="auto"/>
-        <w:tblBorders>
-          <w:top w:val="single" w:sz="4" w:space="0" w:color="000000"/>
-          <w:left w:val="single" w:sz="4" w:space="0" w:color="000000"/>
-          <w:bottom w:val="single" w:sz="4" w:space="0" w:color="000000"/>
-          <w:right w:val="single" w:sz="4" w:space="0" w:color="000000"/>
-          <w:insideH w:val="single" w:sz="4" w:space="0" w:color="000000"/>
-          <w:insideV w:val="single" w:sz="4" w:space="0" w:color="000000"/>
-        </w:tblBorders>
-      </w:tblPr>
-      <w:tr>
-        <w:tc>
-          <w:tcPr>
-            <w:tcW w:w="2400" w:type="dxa"/>
-          </w:tcPr>
-          <w:p>
-            <w:r>
-              <w:t xml:space="preserve">项目名称</w:t>
-            </w:r>
-          </w:p>
-        </w:tc>
-        <w:tc>
-          <w:tcPr>
-            <w:tcW w:w="2400" w:type="dxa"/>
-          </w:tcPr>
-          <w:p>
-            <w:r>
-              <w:t xml:space="preserve">单位</w:t>
-            </w:r>
-          </w:p>
-        </w:tc>
-        <w:tc>
-          <w:tcPr>
-            <w:tcW w:w="2400" w:type="dxa"/>
-          </w:tcPr>
-          <w:p>
-            <w:r>
-              <w:t xml:space="preserve">工程量</w:t>
-            </w:r>
-          </w:p>
-        </w:tc>
-        <w:tc>
-          <w:tcPr>
-            <w:tcW w:w="2400" w:type="dxa"/>
-          </w:tcPr>
-          <w:p>
-            <w:r>
-              <w:t xml:space="preserve">含税单价</w:t>
-            </w:r>
-          </w:p>
-        </w:tc>
-        <w:tc>
-          <w:tcPr>
-            <w:tcW w:w="2400" w:type="dxa"/>
-          </w:tcPr>
-          <w:p>
-            <w:r>
-              <w:t xml:space="preserve">合计</w:t>
-            </w:r>
-          </w:p>
-        </w:tc>
-        <w:tc>
-          <w:tcPr>
-            <w:tcW w:w="2400" w:type="dxa"/>
-          </w:tcPr>
-          <w:p>
-            <w:r>
-              <w:t xml:space="preserve">备注</w:t>
-            </w:r>
-          </w:p>
-        </w:tc>
-      </w:tr>
-      <w:tr>
-        <w:tc>
-          <w:tcPr>
-            <w:tcW w:w="2400" w:type="dxa"/>
-          </w:tcPr>
-          <w:p>
-            <w:r>
-              <w:t xml:space="preserve">{itemName}</w:t>
-            </w:r>
-          </w:p>
-        </w:tc>
-        <w:tc>
-          <w:tcPr>
-            <w:tcW w:w="2400" w:type="dxa"/>
-          </w:tcPr>
-          <w:p>
-            <w:r>
-              <w:t xml:space="preserve">{unit}</w:t>
-            </w:r>
-          </w:p>
-        </w:tc>
-        <w:tc>
-          <w:tcPr>
-            <w:tcW w:w="2400" w:type="dxa"/>
-          </w:tcPr>
-          <w:p>
-            <w:r>
-              <w:t xml:space="preserve">{quantity}</w:t>
-            </w:r>
-          </w:p>
-        </w:tc>
-        <w:tc>
-          <w:tcPr>
-            <w:tcW w:w="2400" w:type="dxa"/>
-          </w:tcPr>
-          <w:p>
-            <w:r>
-              <w:t xml:space="preserve">{unitPrice}</w:t>
-            </w:r>
-          </w:p>
-        </w:tc>
-        <w:tc>
-          <w:tcPr>
-            <w:tcW w:w="2400" w:type="dxa"/>
-          </w:tcPr>
-          <w:p>
-            <w:r>
-              <w:t xml:space="preserve">{taxInclusiveAmount}</w:t>
-            </w:r>
-          </w:p>
-        </w:tc>
-        <w:tc>
-          <w:tcPr>
-            <w:tcW w:w="2400" w:type="dxa"/>
-          </w:tcPr>
-          <w:p>
-            <w:r>
-              <w:t xml:space="preserve">{remark}</w:t>
-            </w:r>
-          </w:p>
-        </w:tc>
-      </w:tr>
-    </w:tbl>
-    <w:p>
-      <w:r>
-        <w:t xml:space="preserve">{/bill.laborItems}</w:t>
-      </w:r>
-    </w:p>
-    <w:p>
-      <w:r>
-        <w:br w:type="page"/>
-      </w:r>
-    </w:p>
-    <w:p>
-      <w:pPr>
         <w:pStyle w:val="Normal"/>
         <w:jc w:val="end"/>
         <w:rPr>
@@ -394,40 +15,7 @@
         </w:rPr>
       </w:pPr>
       <w:r>
-        <w:rPr>
-          <w:rFonts w:ascii="宋体" w:hAnsi="宋体" w:cs="宋体" w:hint="eastAsia"/>
-          <w:sz w:val="24"/>
-          <w:szCs w:val="24"/>
-          <w:u w:val="none"/>
-        </w:rPr>
-        <w:t>合同编号：</w:t>
-      </w:r>
-      <w:r>
-        <w:rPr>
-          <w:rFonts w:eastAsia="宋体" w:cs="宋体" w:hint="eastAsia" w:ascii="宋体" w:hAnsi="宋体"/>
-          <w:sz w:val="24"/>
-          <w:szCs w:val="24"/>
-          <w:u w:val="none"/>
-        </w:rPr>
-        <w:t>CHYB-2026-</w:t>
-      </w:r>
-      <w:r>
-        <w:rPr>
-          <w:rFonts w:ascii="宋体" w:hAnsi="宋体" w:cs="宋体" w:hint="eastAsia"/>
-          <w:sz w:val="24"/>
-          <w:szCs w:val="24"/>
-          <w:u w:val="none"/>
-        </w:rPr>
-        <w:t>劳务</w:t>
-      </w:r>
-      <w:r>
-        <w:rPr>
-          <w:rFonts w:eastAsia="宋体" w:cs="宋体" w:hint="eastAsia" w:ascii="宋体" w:hAnsi="宋体"/>
-          <w:sz w:val="24"/>
-          <w:szCs w:val="24"/>
-          <w:u w:val="none"/>
-        </w:rPr>
-        <w:t>-001</w:t>
+        <w:t xml:space="preserve">合同编号：{contract.temporaryCode}</w:t>
       </w:r>
     </w:p>
     <w:p>
@@ -477,6 +65,12 @@
         </w:rPr>
       </w:pPr>
       <w:r>
+        <w:t xml:space="preserve">{contract.name}</w:t>
+      </w:r>
+    </w:p>
+    <w:p>
+      <w:pPr>
+        <w:pStyle w:val="Normal"/>
         <w:rPr>
           <w:rFonts w:hint="eastAsia"/>
           <w:b/>
@@ -484,8 +78,7 @@
           <w:sz w:val="44"/>
           <w:szCs w:val="44"/>
         </w:rPr>
-        <w:t xml:space="preserve"> </w:t>
-      </w:r>
+      </w:pPr>
       <w:r>
         <w:rPr>
           <w:rFonts w:hint="eastAsia"/>
@@ -494,28 +87,6 @@
           <w:sz w:val="44"/>
           <w:szCs w:val="44"/>
         </w:rPr>
-        <w:t>劳务分包合同</w:t>
-      </w:r>
-    </w:p>
-    <w:p>
-      <w:pPr>
-        <w:pStyle w:val="Normal"/>
-        <w:rPr>
-          <w:rFonts w:hint="eastAsia"/>
-          <w:b/>
-          <w:bCs/>
-          <w:sz w:val="44"/>
-          <w:szCs w:val="44"/>
-        </w:rPr>
-      </w:pPr>
-      <w:r>
-        <w:rPr>
-          <w:rFonts w:hint="eastAsia"/>
-          <w:b/>
-          <w:bCs/>
-          <w:sz w:val="44"/>
-          <w:szCs w:val="44"/>
-        </w:rPr>
       </w:r>
     </w:p>
     <w:p>
@@ -1132,20 +703,7 @@
         </w:rPr>
       </w:pPr>
       <w:r>
-        <w:rPr>
-          <w:rFonts w:hint="eastAsia"/>
-          <w:sz w:val="28"/>
-        </w:rPr>
-        <w:t>劳务分包工程名称：</w:t>
-      </w:r>
-      <w:r>
-        <w:rPr>
-          <w:rFonts w:ascii="宋体" w:hAnsi="宋体" w:cs="Times New Roman" w:hint="eastAsia" w:eastAsia="宋体"/>
-          <w:sz w:val="28"/>
-          <w:szCs w:val="28"/>
-          <w:u w:val="single"/>
-        </w:rPr>
-        <w:t xml:space="preserve">                   </w:t>
+        <w:t xml:space="preserve">劳务分包工程名称：{contract.name}</w:t>
       </w:r>
     </w:p>
     <w:p>
@@ -1159,20 +717,7 @@
         </w:rPr>
       </w:pPr>
       <w:r>
-        <w:rPr>
-          <w:rFonts w:hint="eastAsia"/>
-          <w:sz w:val="28"/>
-        </w:rPr>
-        <w:t>劳务分包作业地点：</w:t>
-      </w:r>
-      <w:r>
-        <w:rPr>
-          <w:rFonts w:ascii="宋体" w:hAnsi="宋体" w:cs="Times New Roman" w:hint="eastAsia" w:eastAsia="宋体"/>
-          <w:sz w:val="28"/>
-          <w:szCs w:val="28"/>
-          <w:u w:val="single"/>
-        </w:rPr>
-        <w:t xml:space="preserve">                   </w:t>
+        <w:t xml:space="preserve">劳务分包作业地点：{field.workLocation}</w:t>
       </w:r>
     </w:p>
     <w:p>
@@ -1204,20 +749,7 @@
         </w:rPr>
       </w:pPr>
       <w:r>
-        <w:rPr>
-          <w:rFonts w:hint="eastAsia"/>
-          <w:b/>
-          <w:sz w:val="28"/>
-        </w:rPr>
-        <w:t>1</w:t>
-      </w:r>
-      <w:r>
-        <w:rPr>
-          <w:rFonts w:hint="eastAsia"/>
-          <w:b/>
-          <w:sz w:val="28"/>
-        </w:rPr>
-        <w:t>、劳务分包作业范围及内容：</w:t>
+        <w:t xml:space="preserve">1、劳务分包作业范围及内容：{field.workScope}</w:t>
       </w:r>
     </w:p>
     <w:p>
@@ -1719,40 +1251,7 @@
         </w:rPr>
       </w:pPr>
       <w:r>
-        <w:rPr>
-          <w:rFonts w:hint="eastAsia"/>
-          <w:sz w:val="28"/>
-        </w:rPr>
-        <w:t>工期以总包合同为准，具体开工日期按照甲方项目部通知执行。乙方应做到按时按质按期完工，遵守现场安全文明施工要求，做到工完场清。如因乙方任何原因而导致工程不能按时按质完成，将按每天</w:t>
-      </w:r>
-      <w:r>
-        <w:rPr>
-          <w:rFonts w:hint="eastAsia"/>
-          <w:sz w:val="28"/>
-          <w:u w:val="single"/>
-        </w:rPr>
-        <w:t>5000</w:t>
-      </w:r>
-      <w:r>
-        <w:rPr>
-          <w:rFonts w:hint="eastAsia"/>
-          <w:sz w:val="28"/>
-        </w:rPr>
-        <w:t>元人民币罚款，罚款在结算时扣除。另在甲方认为乙方形象进度达不到本工程要求时，甲方有权将剩余工程量交给第三方施工，</w:t>
-      </w:r>
-      <w:r>
-        <w:rPr>
-          <w:rFonts w:hint="eastAsia"/>
-          <w:sz w:val="28"/>
-        </w:rPr>
-        <w:t>甲方按实际用工费用的两倍从乙方结算款中扣除</w:t>
-      </w:r>
-      <w:r>
-        <w:rPr>
-          <w:rFonts w:hint="eastAsia"/>
-          <w:sz w:val="28"/>
-        </w:rPr>
-        <w:t>。因甲方原因（材料不到位、施工影响）导致的工期延误，乙方不承担责任。如增加工程内容导致工期延误，则以甲方与发包人办理签证的工期为准。</w:t>
+        <w:t xml:space="preserve">计划工期：{field.plannedStartDate}至{field.plannedEndDate}。</w:t>
       </w:r>
     </w:p>
     <w:p>
@@ -2128,162 +1627,7 @@
         </w:rPr>
       </w:pPr>
       <w:r>
-        <w:rPr>
-          <w:rFonts w:ascii="宋体" w:hAnsi="宋体" w:cs="宋体" w:hint="eastAsia"/>
-          <w:b/>
-          <w:bCs/>
-          <w:sz w:val="28"/>
-          <w:szCs w:val="28"/>
-        </w:rPr>
-        <w:t>（</w:t>
-      </w:r>
-      <w:r>
-        <w:rPr>
-          <w:rFonts w:cs="宋体" w:hint="eastAsia" w:ascii="宋体" w:hAnsi="宋体"/>
-          <w:b/>
-          <w:bCs/>
-          <w:sz w:val="28"/>
-          <w:szCs w:val="28"/>
-        </w:rPr>
-        <w:t>1</w:t>
-      </w:r>
-      <w:r>
-        <w:rPr>
-          <w:rFonts w:ascii="宋体" w:hAnsi="宋体" w:cs="宋体" w:hint="eastAsia"/>
-          <w:b/>
-          <w:bCs/>
-          <w:sz w:val="28"/>
-          <w:szCs w:val="28"/>
-        </w:rPr>
-        <w:t>）</w:t>
-      </w:r>
-      <w:r>
-        <w:rPr>
-          <w:rFonts w:ascii="宋体" w:hAnsi="宋体" w:cs="Times New Roman" w:hint="eastAsia"/>
-          <w:b/>
-          <w:bCs/>
-          <w:sz w:val="28"/>
-          <w:szCs w:val="28"/>
-        </w:rPr>
-        <w:t>固定单价</w:t>
-      </w:r>
-      <w:r>
-        <w:rPr>
-          <w:rFonts w:ascii="宋体" w:hAnsi="宋体" w:cs="宋体" w:hint="eastAsia"/>
-          <w:b/>
-          <w:bCs/>
-          <w:sz w:val="28"/>
-          <w:szCs w:val="28"/>
-        </w:rPr>
-        <w:t>，</w:t>
-      </w:r>
-      <w:r>
-        <w:rPr>
-          <w:rFonts w:hint="eastAsia"/>
-          <w:bCs/>
-          <w:sz w:val="28"/>
-        </w:rPr>
-        <w:t>单价详见后附“劳务</w:t>
-      </w:r>
-      <w:r>
-        <w:rPr>
-          <w:rFonts w:hint="eastAsia"/>
-          <w:sz w:val="28"/>
-        </w:rPr>
-        <w:t>分包</w:t>
-      </w:r>
-      <w:r>
-        <w:rPr>
-          <w:rFonts w:hint="eastAsia"/>
-          <w:bCs/>
-          <w:sz w:val="28"/>
-        </w:rPr>
-        <w:t>价格清单”；</w:t>
-      </w:r>
-      <w:r>
-        <w:rPr>
-          <w:rFonts w:ascii="宋体" w:hAnsi="宋体" w:cs="宋体" w:hint="eastAsia"/>
-          <w:sz w:val="28"/>
-          <w:szCs w:val="28"/>
-        </w:rPr>
-        <w:t>合同暂定含税总价为</w:t>
-      </w:r>
-      <w:r>
-        <w:rPr>
-          <w:rFonts w:ascii="宋体" w:hAnsi="宋体" w:cs="宋体" w:hint="eastAsia"/>
-          <w:sz w:val="28"/>
-          <w:szCs w:val="28"/>
-          <w:u w:val="none"/>
-        </w:rPr>
-        <w:t>人民币（大写）</w:t>
-      </w:r>
-      <w:r>
-        <w:rPr>
-          <w:rFonts w:ascii="宋体" w:hAnsi="宋体" w:cs="宋体" w:hint="eastAsia"/>
-          <w:sz w:val="28"/>
-          <w:szCs w:val="28"/>
-          <w:u w:val="single"/>
-        </w:rPr>
-        <w:t xml:space="preserve">  </w:t>
-      </w:r>
-      <w:r>
-        <w:rPr>
-          <w:rFonts w:cs="宋体" w:hint="eastAsia" w:ascii="宋体" w:hAnsi="宋体"/>
-          <w:sz w:val="28"/>
-          <w:szCs w:val="28"/>
-          <w:u w:val="single"/>
-        </w:rPr>
-        <w:t xml:space="preserve">/ </w:t>
-      </w:r>
-      <w:r>
-        <w:rPr>
-          <w:rFonts w:ascii="宋体" w:hAnsi="宋体" w:cs="宋体" w:hint="eastAsia"/>
-          <w:sz w:val="28"/>
-          <w:szCs w:val="28"/>
-          <w:u w:val="single"/>
-        </w:rPr>
-        <w:t>（</w:t>
-      </w:r>
-      <w:r>
-        <w:rPr>
-          <w:rFonts w:cs="宋体" w:hint="eastAsia" w:ascii="宋体" w:hAnsi="宋体"/>
-          <w:sz w:val="28"/>
-          <w:szCs w:val="28"/>
-          <w:u w:val="single"/>
-        </w:rPr>
-        <w:t xml:space="preserve">¥ / </w:t>
-      </w:r>
-      <w:r>
-        <w:rPr>
-          <w:rFonts w:ascii="宋体" w:hAnsi="宋体" w:cs="宋体" w:hint="eastAsia"/>
-          <w:sz w:val="28"/>
-          <w:szCs w:val="28"/>
-          <w:u w:val="single"/>
-        </w:rPr>
-        <w:t>元）</w:t>
-      </w:r>
-      <w:r>
-        <w:rPr>
-          <w:rFonts w:ascii="宋体" w:hAnsi="宋体" w:cs="宋体" w:hint="eastAsia"/>
-          <w:sz w:val="28"/>
-          <w:szCs w:val="28"/>
-        </w:rPr>
-        <w:t>。</w:t>
-      </w:r>
-      <w:r>
-        <w:rPr>
-          <w:rFonts w:hint="eastAsia"/>
-          <w:bCs/>
-          <w:sz w:val="28"/>
-        </w:rPr>
-        <w:t>本合同为最高限价合同，若结算总价超过本合同暂定总价的，超出的部分需另外签订补充协议。（注：结算工程量</w:t>
-      </w:r>
-      <w:r>
-        <w:rPr>
-          <w:rFonts w:hint="eastAsia"/>
-          <w:sz w:val="28"/>
-        </w:rPr>
-        <w:t>以建设单位或总包方、监理单位、甲方签证确认为准。）</w:t>
+        <w:t xml:space="preserve">合同金额大写：{contract.amountUppercase}。</w:t>
       </w:r>
     </w:p>
     <w:p>
@@ -2299,118 +1643,7 @@
         </w:rPr>
       </w:pPr>
       <w:r>
-        <w:rPr>
-          <w:rFonts w:ascii="宋体" w:hAnsi="宋体" w:cs="宋体" w:hint="eastAsia"/>
-          <w:b/>
-          <w:bCs/>
-          <w:sz w:val="28"/>
-          <w:szCs w:val="28"/>
-        </w:rPr>
-        <w:t>（</w:t>
-      </w:r>
-      <w:r>
-        <w:rPr>
-          <w:rFonts w:cs="宋体" w:hint="eastAsia" w:ascii="宋体" w:hAnsi="宋体"/>
-          <w:b/>
-          <w:bCs/>
-          <w:sz w:val="28"/>
-          <w:szCs w:val="28"/>
-        </w:rPr>
-        <w:t>2</w:t>
-      </w:r>
-      <w:r>
-        <w:rPr>
-          <w:rFonts w:ascii="宋体" w:hAnsi="宋体" w:cs="宋体" w:hint="eastAsia"/>
-          <w:b/>
-          <w:bCs/>
-          <w:sz w:val="28"/>
-          <w:szCs w:val="28"/>
-        </w:rPr>
-        <w:t>）固定总价</w:t>
-      </w:r>
-      <w:r>
-        <w:rPr>
-          <w:rFonts w:ascii="宋体" w:hAnsi="宋体" w:cs="宋体" w:hint="eastAsia"/>
-          <w:sz w:val="28"/>
-          <w:szCs w:val="28"/>
-        </w:rPr>
-        <w:t>，对合同约定的清单及图纸范围内工程量以及为完成该工程量而实施的全部工作进行总价包干，合同含税总价为</w:t>
-      </w:r>
-      <w:r>
-        <w:rPr>
-          <w:rFonts w:ascii="宋体" w:hAnsi="宋体" w:cs="宋体" w:hint="eastAsia"/>
-          <w:sz w:val="28"/>
-          <w:szCs w:val="28"/>
-          <w:u w:val="none"/>
-        </w:rPr>
-        <w:t>人民币（大写）</w:t>
-      </w:r>
-      <w:r>
-        <w:rPr>
-          <w:rFonts w:ascii="宋体" w:hAnsi="宋体" w:cs="宋体" w:hint="eastAsia"/>
-          <w:sz w:val="28"/>
-          <w:szCs w:val="28"/>
-          <w:u w:val="single"/>
-        </w:rPr>
-        <w:t xml:space="preserve">      （</w:t>
-      </w:r>
-      <w:r>
-        <w:rPr>
-          <w:rFonts w:cs="宋体" w:hint="eastAsia" w:ascii="宋体" w:hAnsi="宋体"/>
-          <w:sz w:val="28"/>
-          <w:szCs w:val="28"/>
-          <w:u w:val="single"/>
-        </w:rPr>
-        <w:t>¥</w:t>
-      </w:r>
-      <w:r>
-        <w:rPr>
-          <w:rFonts w:eastAsia="宋体" w:cs="Times New Roman" w:hint="eastAsia" w:ascii="宋体" w:hAnsi="宋体"/>
-          <w:sz w:val="28"/>
-          <w:szCs w:val="28"/>
-          <w:u w:val="single"/>
-        </w:rPr>
-        <w:t xml:space="preserve">  </w:t>
-      </w:r>
-      <w:r>
-        <w:rPr>
-          <w:rFonts w:ascii="宋体" w:hAnsi="宋体" w:cs="宋体" w:hint="eastAsia"/>
-          <w:sz w:val="28"/>
-          <w:szCs w:val="28"/>
-          <w:u w:val="single"/>
-        </w:rPr>
-        <w:t>元）</w:t>
-      </w:r>
-      <w:r>
-        <w:rPr>
-          <w:rFonts w:ascii="宋体" w:hAnsi="宋体" w:cs="宋体" w:hint="eastAsia"/>
-          <w:sz w:val="28"/>
-          <w:szCs w:val="28"/>
-        </w:rPr>
-        <w:t>。除业主增减工程量和设计变更外，合同总价一律不予调整。</w:t>
-      </w:r>
-      <w:r>
-        <w:rPr>
-          <w:rFonts w:hint="eastAsia"/>
-          <w:bCs/>
-          <w:sz w:val="28"/>
-        </w:rPr>
-        <w:t>（详见后附“劳务</w:t>
-      </w:r>
-      <w:r>
-        <w:rPr>
-          <w:rFonts w:hint="eastAsia"/>
-          <w:sz w:val="28"/>
-        </w:rPr>
-        <w:t>分包</w:t>
-      </w:r>
-      <w:r>
-        <w:rPr>
-          <w:rFonts w:hint="eastAsia"/>
-          <w:bCs/>
-          <w:sz w:val="28"/>
-        </w:rPr>
-        <w:t xml:space="preserve">价格清单”）   </w:t>
+        <w:t xml:space="preserve">（2）固定总价，对合同约定的清单及图纸范围内工程量以及为完成该工程量而实施的全部工作进行总价包干，合同金额大写：{contract.amountUppercase}。</w:t>
       </w:r>
     </w:p>
     <w:p>
@@ -2491,100 +1724,7 @@
         </w:rPr>
       </w:pPr>
       <w:r>
-        <w:rPr>
-          <w:rFonts w:ascii="Calibri" w:hAnsi="Calibri" w:cs="Times New Roman" w:hint="eastAsia" w:eastAsia="宋体"/>
-          <w:sz w:val="28"/>
-        </w:rPr>
-        <w:t>（</w:t>
-      </w:r>
-      <w:r>
-        <w:rPr>
-          <w:rFonts w:eastAsia="宋体" w:cs="Times New Roman" w:hint="eastAsia" w:ascii="Calibri" w:hAnsi="Calibri"/>
-          <w:sz w:val="28"/>
-        </w:rPr>
-        <w:t>1</w:t>
-      </w:r>
-      <w:r>
-        <w:rPr>
-          <w:rFonts w:ascii="Calibri" w:hAnsi="Calibri" w:cs="Times New Roman" w:hint="eastAsia" w:eastAsia="宋体"/>
-          <w:sz w:val="28"/>
-        </w:rPr>
-        <w:t>）本工程的进度款支付应结合总（分）包合同，甲方在收到发包人支付 的工程款项后按每月审核确认乙方已完成工程量进行结算，按审核审定的已完 成合格工程进度款的</w:t>
-      </w:r>
-      <w:r>
-        <w:rPr>
-          <w:rFonts w:eastAsia="宋体" w:cs="Times New Roman" w:hint="eastAsia" w:ascii="Calibri" w:hAnsi="Calibri"/>
-          <w:sz w:val="28"/>
-          <w:u w:val="single"/>
-        </w:rPr>
-        <w:t>80%</w:t>
-      </w:r>
-      <w:r>
-        <w:rPr>
-          <w:rFonts w:ascii="Calibri" w:hAnsi="Calibri" w:cs="Times New Roman" w:hint="eastAsia" w:eastAsia="宋体"/>
-          <w:sz w:val="28"/>
-        </w:rPr>
-        <w:t>进行支付；乙方完成现场施工内容和合同约定工作 范围和内容，提供相关的技术质量保证资料给甲方验收合格且甲方收到发包人支付相应工程款后，进度款支付至</w:t>
-      </w:r>
-      <w:r>
-        <w:rPr>
-          <w:rFonts w:eastAsia="宋体" w:cs="Times New Roman" w:hint="eastAsia" w:ascii="Calibri" w:hAnsi="Calibri"/>
-          <w:sz w:val="28"/>
-          <w:u w:val="single"/>
-        </w:rPr>
-        <w:t xml:space="preserve">85% </w:t>
-      </w:r>
-      <w:r>
-        <w:rPr>
-          <w:rFonts w:ascii="Calibri" w:hAnsi="Calibri" w:cs="Times New Roman" w:hint="eastAsia" w:eastAsia="宋体"/>
-          <w:sz w:val="28"/>
-        </w:rPr>
-        <w:t>，项目竣工验收、外部结算完成</w:t>
-      </w:r>
-      <w:r>
-        <w:rPr>
-          <w:rFonts w:eastAsia="宋体" w:cs="Times New Roman" w:hint="eastAsia" w:ascii="Calibri" w:hAnsi="Calibri"/>
-          <w:sz w:val="28"/>
-          <w:u w:val="single"/>
-        </w:rPr>
-        <w:t>180</w:t>
-      </w:r>
-      <w:r>
-        <w:rPr>
-          <w:rFonts w:ascii="Calibri" w:hAnsi="Calibri" w:cs="Times New Roman" w:hint="eastAsia" w:eastAsia="宋体"/>
-          <w:sz w:val="28"/>
-        </w:rPr>
-        <w:t>天且发包人支付承包人工程尾款后工程款支付至</w:t>
-      </w:r>
-      <w:r>
-        <w:rPr>
-          <w:rFonts w:eastAsia="宋体" w:cs="Times New Roman" w:hint="eastAsia" w:ascii="Calibri" w:hAnsi="Calibri"/>
-          <w:sz w:val="28"/>
-          <w:u w:val="single"/>
-        </w:rPr>
-        <w:t>95%</w:t>
-      </w:r>
-      <w:r>
-        <w:rPr>
-          <w:rFonts w:ascii="Calibri" w:hAnsi="Calibri" w:cs="Times New Roman" w:hint="eastAsia" w:eastAsia="宋体"/>
-          <w:sz w:val="28"/>
-        </w:rPr>
-        <w:t>，剩余</w:t>
-      </w:r>
-      <w:r>
-        <w:rPr>
-          <w:rFonts w:eastAsia="宋体" w:cs="Times New Roman" w:hint="eastAsia" w:ascii="Calibri" w:hAnsi="Calibri"/>
-          <w:sz w:val="28"/>
-          <w:u w:val="single"/>
-        </w:rPr>
-        <w:t>5%</w:t>
-      </w:r>
-      <w:r>
-        <w:rPr>
-          <w:rFonts w:ascii="Calibri" w:hAnsi="Calibri" w:cs="Times New Roman" w:hint="eastAsia" w:eastAsia="宋体"/>
-          <w:sz w:val="28"/>
-        </w:rPr>
-        <w:t>作为质量保修金，质保期满后，乙方全面履行保修责任，且没有质量缺陷和遗留问题责任存在，甲方一次性退还保修金，不计利息。</w:t>
+        <w:t xml:space="preserve">付款方式：{clause.payment.text} 结算周期：{field.settlementCycle}；进度款支付比例：{field.progressPaymentRatioPercent}%。</w:t>
       </w:r>
     </w:p>
     <w:p>
@@ -4564,46 +3704,7 @@
         </w:rPr>
       </w:pPr>
       <w:r>
-        <w:rPr>
-          <w:rFonts w:hint="eastAsia"/>
-          <w:color w:val="000000"/>
-          <w:sz w:val="28"/>
-        </w:rPr>
-        <w:t>后附：</w:t>
-      </w:r>
-      <w:r>
-        <w:rPr>
-          <w:rFonts w:hint="eastAsia"/>
-          <w:bCs/>
-          <w:color w:val="000000"/>
-          <w:sz w:val="28"/>
-        </w:rPr>
-        <w:t>劳务</w:t>
-      </w:r>
-      <w:r>
-        <w:rPr>
-          <w:rFonts w:hint="eastAsia"/>
-          <w:color w:val="000000"/>
-          <w:sz w:val="28"/>
-        </w:rPr>
-        <w:t>分包</w:t>
-      </w:r>
-      <w:r>
-        <w:rPr>
-          <w:rFonts w:hint="eastAsia"/>
-          <w:bCs/>
-          <w:color w:val="000000"/>
-          <w:sz w:val="28"/>
-        </w:rPr>
-        <w:t>价格清单、营业执照复印件</w:t>
-      </w:r>
-      <w:r>
-        <w:rPr>
-          <w:rFonts w:hint="eastAsia"/>
-          <w:color w:val="000000"/>
-          <w:sz w:val="28"/>
-        </w:rPr>
-        <w:t>、开户许可证复印件。</w:t>
+        <w:t xml:space="preserve">后附：劳务分包价格清单、安全生产管理协议、民工工资兑现承诺书。</w:t>
       </w:r>
     </w:p>
     <w:p>
@@ -4703,56 +3804,6 @@
           <w:szCs w:val="22"/>
         </w:rPr>
         <w:t>附件三：劳务分包价格清单</w:t>
-      </w:r>
-    </w:p>
-    <w:p>
-      <w:pPr>
-        <w:pStyle w:val="Normal"/>
-        <w:tabs>
-          <w:tab w:val="clear" w:pos="420"/>
-          <w:tab w:val="left" w:pos="5555" w:leader="none"/>
-          <w:tab w:val="left" w:pos="11118" w:leader="none"/>
-        </w:tabs>
-        <w:rPr>
-          <w:rFonts w:ascii="Times New Roman" w:hAnsi="Times New Roman" w:eastAsia="宋体" w:cs="Times New Roman"/>
-          <w:color w:val="000000"/>
-          <w:kern w:val="2"/>
-          <w:sz w:val="24"/>
-          <w:szCs w:val="22"/>
-        </w:rPr>
-      </w:pPr>
-      <w:r>
-        <w:rPr>
-          <w:rFonts w:ascii="Times New Roman" w:hAnsi="Times New Roman" w:cs="Times New Roman" w:hint="eastAsia" w:eastAsia="宋体"/>
-          <w:color w:val="000000"/>
-          <w:kern w:val="2"/>
-          <w:sz w:val="24"/>
-          <w:szCs w:val="22"/>
-        </w:rPr>
-        <w:t>附件四：营业执照复印件</w:t>
-      </w:r>
-    </w:p>
-    <w:p>
-      <w:pPr>
-        <w:pStyle w:val="Style13"/>
-        <w:ind w:firstLineChars="0" w:firstLine="0" w:startChars="0" w:start="0" w:endChars="0" w:end="0"/>
-        <w:rPr>
-          <w:rFonts w:ascii="Times New Roman" w:hAnsi="Times New Roman" w:eastAsia="宋体" w:cs="Times New Roman" w:hint="eastAsia"/>
-          <w:color w:val="000000"/>
-          <w:kern w:val="2"/>
-          <w:sz w:val="24"/>
-          <w:szCs w:val="22"/>
-        </w:rPr>
-      </w:pPr>
-      <w:r>
-        <w:rPr>
-          <w:rFonts w:ascii="Times New Roman" w:hAnsi="Times New Roman" w:cs="Times New Roman" w:hint="eastAsia" w:eastAsia="宋体"/>
-          <w:color w:val="000000"/>
-          <w:kern w:val="2"/>
-          <w:sz w:val="24"/>
-          <w:szCs w:val="22"/>
-        </w:rPr>
-        <w:t>附件五：开户许可证复印件</w:t>
       </w:r>
     </w:p>
     <w:p>
@@ -6623,12 +5674,7 @@
         </w:rPr>
       </w:pPr>
       <w:r>
-        <w:rPr>
-          <w:rFonts w:ascii="仿宋" w:hAnsi="仿宋" w:cs="仿宋" w:hint="eastAsia" w:eastAsia="仿宋"/>
-          <w:sz w:val="24"/>
-          <w:szCs w:val="24"/>
-        </w:rPr>
-        <w:t xml:space="preserve">为了确保本工程安全生产工作顺利进行施工，进一步贯彻落实“安全第一、预防为主”的安全生产方针，明确甲乙双方各自的责任，特订立安全生产条款，甲乙双方共同遵守。 </w:t>
+        <w:t xml:space="preserve">{clause.safety.text}</w:t>
       </w:r>
     </w:p>
     <w:p>
@@ -7739,13 +6785,7 @@
         </w:rPr>
       </w:pPr>
       <w:r>
-        <w:rPr>
-          <w:rFonts w:ascii="仿宋" w:hAnsi="仿宋" w:cs="仿宋" w:hint="eastAsia" w:eastAsia="仿宋"/>
-          <w:kern w:val="0"/>
-          <w:sz w:val="24"/>
-          <w:szCs w:val="24"/>
-        </w:rPr>
-        <w:t>为维护社会稳定，规范建筑市场劳务用工秩序，保障建设领域民工的切身利益，乙方做出如下承诺：</w:t>
+        <w:t xml:space="preserve">{clause.wageCommitment.text}</w:t>
       </w:r>
     </w:p>
     <w:p>
@@ -8200,2411 +7240,257 @@
         </w:rPr>
       </w:r>
     </w:p>
+    <w:p>
+      <w:r>
+        <w:t xml:space="preserve">{#bill.laborItems}</w:t>
+      </w:r>
+    </w:p>
     <w:tbl>
       <w:tblPr>
-        <w:tblW w:w="9620" w:type="dxa"/>
-        <w:jc w:val="start"/>
-        <w:tblInd w:w="93" w:type="dxa"/>
-        <w:tblLayout w:type="fixed"/>
-        <w:tblCellMar>
-          <w:top w:w="0" w:type="dxa"/>
-          <w:start w:w="108" w:type="dxa"/>
-          <w:bottom w:w="0" w:type="dxa"/>
-          <w:end w:w="108" w:type="dxa"/>
-        </w:tblCellMar>
+        <w:tblW w:w="0" w:type="auto"/>
+        <w:tblBorders>
+          <w:top w:val="single" w:sz="4" w:space="0" w:color="000000"/>
+          <w:start w:val="single" w:sz="4" w:space="0" w:color="000000"/>
+          <w:bottom w:val="single" w:sz="4" w:space="0" w:color="000000"/>
+          <w:end w:val="single" w:sz="4" w:space="0" w:color="000000"/>
+          <w:insideH w:val="single" w:sz="4" w:space="0" w:color="000000"/>
+          <w:insideV w:val="single" w:sz="4" w:space="0" w:color="000000"/>
+        </w:tblBorders>
       </w:tblPr>
-      <w:tblGrid>
-        <w:gridCol w:w="665"/>
-        <w:gridCol w:w="2481"/>
-        <w:gridCol w:w="1294"/>
-        <w:gridCol w:w="1294"/>
-        <w:gridCol w:w="1294"/>
-        <w:gridCol w:w="1294"/>
-        <w:gridCol w:w="1298"/>
-      </w:tblGrid>
       <w:tr>
-        <w:trPr>
-          <w:trHeight w:val="641" w:hRule="atLeast"/>
-        </w:trPr>
         <w:tc>
           <w:tcPr>
-            <w:tcW w:w="9620" w:type="dxa"/>
-            <w:gridSpan w:val="7"/>
+            <w:tcW w:w="1800" w:type="dxa"/>
             <w:tcBorders>
               <w:top w:val="single" w:sz="4" w:space="0" w:color="000000"/>
               <w:start w:val="single" w:sz="4" w:space="0" w:color="000000"/>
               <w:bottom w:val="single" w:sz="4" w:space="0" w:color="000000"/>
               <w:end w:val="single" w:sz="4" w:space="0" w:color="000000"/>
             </w:tcBorders>
-            <w:vAlign w:val="center"/>
           </w:tcPr>
           <w:p>
-            <w:pPr>
-              <w:pStyle w:val="Normal"/>
-              <w:keepNext w:val="false"/>
-              <w:keepLines w:val="false"/>
-              <w:widowControl/>
-              <w:suppressLineNumbers w:val="0"/>
-              <w:jc w:val="center"/>
-              <w:textAlignment w:val="center"/>
-              <w:rPr>
-                <w:rFonts w:ascii="宋体" w:hAnsi="宋体" w:eastAsia="宋体" w:cs="宋体" w:hint="eastAsia"/>
-                <w:i w:val="false"/>
-                <w:iCs w:val="false"/>
-                <w:color w:val="000000"/>
-                <w:sz w:val="36"/>
-                <w:szCs w:val="36"/>
-                <w:u w:val="none"/>
-              </w:rPr>
-            </w:pPr>
             <w:r>
-              <w:rPr>
-                <w:rFonts w:ascii="宋体" w:hAnsi="宋体" w:cs="宋体" w:hint="eastAsia"/>
-                <w:i w:val="false"/>
-                <w:iCs w:val="false"/>
-                <w:color w:val="000000"/>
-                <w:kern w:val="0"/>
-                <w:sz w:val="36"/>
-                <w:szCs w:val="36"/>
-                <w:u w:val="none"/>
-                <w:lang w:bidi="ar"/>
-              </w:rPr>
-              <w:t>劳务分包清单</w:t>
+              <w:t xml:space="preserve">序号</w:t>
             </w:r>
           </w:p>
         </w:tc>
-      </w:tr>
-      <w:tr>
-        <w:trPr>
-          <w:trHeight w:val="465" w:hRule="atLeast"/>
-        </w:trPr>
         <w:tc>
           <w:tcPr>
-            <w:tcW w:w="9620" w:type="dxa"/>
-            <w:gridSpan w:val="7"/>
+            <w:tcW w:w="1800" w:type="dxa"/>
             <w:tcBorders>
               <w:top w:val="single" w:sz="4" w:space="0" w:color="000000"/>
               <w:start w:val="single" w:sz="4" w:space="0" w:color="000000"/>
               <w:bottom w:val="single" w:sz="4" w:space="0" w:color="000000"/>
               <w:end w:val="single" w:sz="4" w:space="0" w:color="000000"/>
             </w:tcBorders>
-            <w:vAlign w:val="center"/>
           </w:tcPr>
           <w:p>
-            <w:pPr>
-              <w:pStyle w:val="Normal"/>
-              <w:keepNext w:val="false"/>
-              <w:keepLines w:val="false"/>
-              <w:widowControl/>
-              <w:suppressLineNumbers w:val="0"/>
-              <w:jc w:val="start"/>
-              <w:textAlignment w:val="center"/>
-              <w:rPr>
-                <w:rFonts w:ascii="宋体" w:hAnsi="宋体" w:eastAsia="宋体" w:cs="宋体" w:hint="eastAsia"/>
-                <w:i w:val="false"/>
-                <w:iCs w:val="false"/>
-                <w:color w:val="000000"/>
-                <w:sz w:val="22"/>
-                <w:szCs w:val="22"/>
-                <w:u w:val="none"/>
-              </w:rPr>
-            </w:pPr>
             <w:r>
-              <w:rPr>
-                <w:rFonts w:ascii="宋体" w:hAnsi="宋体" w:cs="宋体" w:hint="eastAsia"/>
-                <w:i w:val="false"/>
-                <w:iCs w:val="false"/>
-                <w:color w:val="000000"/>
-                <w:kern w:val="0"/>
-                <w:sz w:val="22"/>
-                <w:szCs w:val="22"/>
-                <w:u w:val="none"/>
-                <w:lang w:bidi="ar"/>
-              </w:rPr>
-              <w:t>工程名称：</w:t>
+              <w:t xml:space="preserve">项目名称</w:t>
             </w:r>
           </w:p>
         </w:tc>
-      </w:tr>
-      <w:tr>
-        <w:trPr>
-          <w:trHeight w:val="465" w:hRule="atLeast"/>
-        </w:trPr>
         <w:tc>
           <w:tcPr>
-            <w:tcW w:w="9620" w:type="dxa"/>
-            <w:gridSpan w:val="7"/>
+            <w:tcW w:w="1800" w:type="dxa"/>
             <w:tcBorders>
               <w:top w:val="single" w:sz="4" w:space="0" w:color="000000"/>
               <w:start w:val="single" w:sz="4" w:space="0" w:color="000000"/>
               <w:bottom w:val="single" w:sz="4" w:space="0" w:color="000000"/>
               <w:end w:val="single" w:sz="4" w:space="0" w:color="000000"/>
             </w:tcBorders>
-            <w:vAlign w:val="center"/>
           </w:tcPr>
           <w:p>
-            <w:pPr>
-              <w:pStyle w:val="Normal"/>
-              <w:keepNext w:val="false"/>
-              <w:keepLines w:val="false"/>
-              <w:widowControl/>
-              <w:suppressLineNumbers w:val="0"/>
-              <w:jc w:val="start"/>
-              <w:textAlignment w:val="center"/>
-              <w:rPr>
-                <w:rFonts w:ascii="宋体" w:hAnsi="宋体" w:eastAsia="宋体" w:cs="宋体" w:hint="eastAsia"/>
-                <w:i w:val="false"/>
-                <w:iCs w:val="false"/>
-                <w:color w:val="000000"/>
-                <w:sz w:val="22"/>
-                <w:szCs w:val="22"/>
-                <w:u w:val="none"/>
-              </w:rPr>
-            </w:pPr>
             <w:r>
-              <w:rPr>
-                <w:rFonts w:ascii="宋体" w:hAnsi="宋体" w:cs="宋体" w:hint="eastAsia"/>
-                <w:i w:val="false"/>
-                <w:iCs w:val="false"/>
-                <w:color w:val="000000"/>
-                <w:kern w:val="0"/>
-                <w:sz w:val="22"/>
-                <w:szCs w:val="22"/>
-                <w:u w:val="none"/>
-                <w:lang w:bidi="ar"/>
-              </w:rPr>
-              <w:t>劳务公司：</w:t>
+              <w:t xml:space="preserve">单位</w:t>
             </w:r>
           </w:p>
         </w:tc>
-      </w:tr>
-      <w:tr>
-        <w:trPr>
-          <w:trHeight w:val="641" w:hRule="atLeast"/>
-        </w:trPr>
         <w:tc>
           <w:tcPr>
-            <w:tcW w:w="665" w:type="dxa"/>
+            <w:tcW w:w="1800" w:type="dxa"/>
             <w:tcBorders>
               <w:top w:val="single" w:sz="4" w:space="0" w:color="000000"/>
               <w:start w:val="single" w:sz="4" w:space="0" w:color="000000"/>
               <w:bottom w:val="single" w:sz="4" w:space="0" w:color="000000"/>
               <w:end w:val="single" w:sz="4" w:space="0" w:color="000000"/>
             </w:tcBorders>
-            <w:vAlign w:val="center"/>
           </w:tcPr>
           <w:p>
-            <w:pPr>
-              <w:pStyle w:val="Normal"/>
-              <w:keepNext w:val="false"/>
-              <w:keepLines w:val="false"/>
-              <w:widowControl/>
-              <w:suppressLineNumbers w:val="0"/>
-              <w:jc w:val="center"/>
-              <w:textAlignment w:val="center"/>
-              <w:rPr>
-                <w:rFonts w:ascii="宋体" w:hAnsi="宋体" w:eastAsia="宋体" w:cs="宋体" w:hint="eastAsia"/>
-                <w:i w:val="false"/>
-                <w:iCs w:val="false"/>
-                <w:color w:val="000000"/>
-                <w:sz w:val="22"/>
-                <w:szCs w:val="22"/>
-                <w:u w:val="none"/>
-              </w:rPr>
-            </w:pPr>
             <w:r>
-              <w:rPr>
-                <w:rFonts w:ascii="宋体" w:hAnsi="宋体" w:cs="宋体" w:hint="eastAsia"/>
-                <w:i w:val="false"/>
-                <w:iCs w:val="false"/>
-                <w:color w:val="000000"/>
-                <w:kern w:val="0"/>
-                <w:sz w:val="22"/>
-                <w:szCs w:val="22"/>
-                <w:u w:val="none"/>
-                <w:lang w:bidi="ar"/>
-              </w:rPr>
-              <w:t>序号</w:t>
+              <w:t xml:space="preserve">工程量</w:t>
             </w:r>
           </w:p>
         </w:tc>
         <w:tc>
           <w:tcPr>
-            <w:tcW w:w="2481" w:type="dxa"/>
+            <w:tcW w:w="1800" w:type="dxa"/>
             <w:tcBorders>
               <w:top w:val="single" w:sz="4" w:space="0" w:color="000000"/>
               <w:start w:val="single" w:sz="4" w:space="0" w:color="000000"/>
               <w:bottom w:val="single" w:sz="4" w:space="0" w:color="000000"/>
               <w:end w:val="single" w:sz="4" w:space="0" w:color="000000"/>
             </w:tcBorders>
-            <w:vAlign w:val="center"/>
           </w:tcPr>
           <w:p>
-            <w:pPr>
-              <w:pStyle w:val="Normal"/>
-              <w:keepNext w:val="false"/>
-              <w:keepLines w:val="false"/>
-              <w:widowControl/>
-              <w:suppressLineNumbers w:val="0"/>
-              <w:jc w:val="center"/>
-              <w:textAlignment w:val="center"/>
-              <w:rPr>
-                <w:rFonts w:ascii="宋体" w:hAnsi="宋体" w:eastAsia="宋体" w:cs="宋体" w:hint="eastAsia"/>
-                <w:i w:val="false"/>
-                <w:iCs w:val="false"/>
-                <w:color w:val="000000"/>
-                <w:sz w:val="22"/>
-                <w:szCs w:val="22"/>
-                <w:u w:val="none"/>
-              </w:rPr>
-            </w:pPr>
             <w:r>
-              <w:rPr>
-                <w:rFonts w:ascii="宋体" w:hAnsi="宋体" w:cs="宋体" w:hint="eastAsia"/>
-                <w:i w:val="false"/>
-                <w:iCs w:val="false"/>
-                <w:color w:val="000000"/>
-                <w:kern w:val="0"/>
-                <w:sz w:val="22"/>
-                <w:szCs w:val="22"/>
-                <w:u w:val="none"/>
-                <w:lang w:bidi="ar"/>
-              </w:rPr>
-              <w:t>项目名称</w:t>
+              <w:t xml:space="preserve">含税单价</w:t>
             </w:r>
           </w:p>
         </w:tc>
         <w:tc>
           <w:tcPr>
-            <w:tcW w:w="1294" w:type="dxa"/>
+            <w:tcW w:w="1800" w:type="dxa"/>
             <w:tcBorders>
               <w:top w:val="single" w:sz="4" w:space="0" w:color="000000"/>
               <w:start w:val="single" w:sz="4" w:space="0" w:color="000000"/>
               <w:bottom w:val="single" w:sz="4" w:space="0" w:color="000000"/>
               <w:end w:val="single" w:sz="4" w:space="0" w:color="000000"/>
             </w:tcBorders>
-            <w:vAlign w:val="center"/>
           </w:tcPr>
           <w:p>
-            <w:pPr>
-              <w:pStyle w:val="Normal"/>
-              <w:keepNext w:val="false"/>
-              <w:keepLines w:val="false"/>
-              <w:widowControl/>
-              <w:suppressLineNumbers w:val="0"/>
-              <w:jc w:val="center"/>
-              <w:textAlignment w:val="center"/>
-              <w:rPr>
-                <w:rFonts w:ascii="宋体" w:hAnsi="宋体" w:eastAsia="宋体" w:cs="宋体" w:hint="eastAsia"/>
-                <w:i w:val="false"/>
-                <w:iCs w:val="false"/>
-                <w:color w:val="000000"/>
-                <w:sz w:val="22"/>
-                <w:szCs w:val="22"/>
-                <w:u w:val="none"/>
-              </w:rPr>
-            </w:pPr>
             <w:r>
-              <w:rPr>
-                <w:rFonts w:ascii="宋体" w:hAnsi="宋体" w:cs="宋体" w:hint="eastAsia"/>
-                <w:i w:val="false"/>
-                <w:iCs w:val="false"/>
-                <w:color w:val="000000"/>
-                <w:kern w:val="0"/>
-                <w:sz w:val="22"/>
-                <w:szCs w:val="22"/>
-                <w:u w:val="none"/>
-                <w:lang w:bidi="ar"/>
-              </w:rPr>
-              <w:t>单位</w:t>
+              <w:t xml:space="preserve">合计</w:t>
             </w:r>
           </w:p>
         </w:tc>
         <w:tc>
           <w:tcPr>
-            <w:tcW w:w="1294" w:type="dxa"/>
+            <w:tcW w:w="1800" w:type="dxa"/>
             <w:tcBorders>
               <w:top w:val="single" w:sz="4" w:space="0" w:color="000000"/>
               <w:start w:val="single" w:sz="4" w:space="0" w:color="000000"/>
               <w:bottom w:val="single" w:sz="4" w:space="0" w:color="000000"/>
               <w:end w:val="single" w:sz="4" w:space="0" w:color="000000"/>
             </w:tcBorders>
-            <w:vAlign w:val="center"/>
           </w:tcPr>
           <w:p>
-            <w:pPr>
-              <w:pStyle w:val="Normal"/>
-              <w:keepNext w:val="false"/>
-              <w:keepLines w:val="false"/>
-              <w:widowControl/>
-              <w:suppressLineNumbers w:val="0"/>
-              <w:jc w:val="center"/>
-              <w:textAlignment w:val="center"/>
-              <w:rPr>
-                <w:rFonts w:ascii="宋体" w:hAnsi="宋体" w:eastAsia="宋体" w:cs="宋体" w:hint="eastAsia"/>
-                <w:i w:val="false"/>
-                <w:iCs w:val="false"/>
-                <w:color w:val="000000"/>
-                <w:sz w:val="22"/>
-                <w:szCs w:val="22"/>
-                <w:u w:val="none"/>
-              </w:rPr>
-            </w:pPr>
             <w:r>
-              <w:rPr>
-                <w:rFonts w:ascii="宋体" w:hAnsi="宋体" w:cs="宋体" w:hint="eastAsia"/>
-                <w:i w:val="false"/>
-                <w:iCs w:val="false"/>
-                <w:color w:val="000000"/>
-                <w:kern w:val="0"/>
-                <w:sz w:val="22"/>
-                <w:szCs w:val="22"/>
-                <w:u w:val="none"/>
-                <w:lang w:bidi="ar"/>
-              </w:rPr>
-              <w:t>工程量</w:t>
+              <w:t xml:space="preserve">备注</w:t>
             </w:r>
           </w:p>
         </w:tc>
+      </w:tr>
+      <w:tr>
         <w:tc>
           <w:tcPr>
-            <w:tcW w:w="1294" w:type="dxa"/>
+            <w:tcW w:w="1800" w:type="dxa"/>
             <w:tcBorders>
               <w:top w:val="single" w:sz="4" w:space="0" w:color="000000"/>
               <w:start w:val="single" w:sz="4" w:space="0" w:color="000000"/>
               <w:bottom w:val="single" w:sz="4" w:space="0" w:color="000000"/>
               <w:end w:val="single" w:sz="4" w:space="0" w:color="000000"/>
             </w:tcBorders>
-            <w:vAlign w:val="center"/>
           </w:tcPr>
           <w:p>
-            <w:pPr>
-              <w:pStyle w:val="Normal"/>
-              <w:keepNext w:val="false"/>
-              <w:keepLines w:val="false"/>
-              <w:widowControl/>
-              <w:suppressLineNumbers w:val="0"/>
-              <w:jc w:val="center"/>
-              <w:textAlignment w:val="center"/>
-              <w:rPr>
-                <w:rFonts w:ascii="宋体" w:hAnsi="宋体" w:eastAsia="宋体" w:cs="宋体" w:hint="eastAsia"/>
-                <w:i w:val="false"/>
-                <w:iCs w:val="false"/>
-                <w:color w:val="000000"/>
-                <w:sz w:val="22"/>
-                <w:szCs w:val="22"/>
-                <w:u w:val="none"/>
-              </w:rPr>
-            </w:pPr>
             <w:r>
-              <w:rPr>
-                <w:rFonts w:ascii="宋体" w:hAnsi="宋体" w:cs="宋体" w:hint="eastAsia"/>
-                <w:i w:val="false"/>
-                <w:iCs w:val="false"/>
-                <w:color w:val="000000"/>
-                <w:kern w:val="0"/>
-                <w:sz w:val="22"/>
-                <w:szCs w:val="22"/>
-                <w:u w:val="none"/>
-                <w:lang w:bidi="ar"/>
-              </w:rPr>
-              <w:t>单价</w:t>
+              <w:t xml:space="preserve"/>
             </w:r>
           </w:p>
         </w:tc>
         <w:tc>
           <w:tcPr>
-            <w:tcW w:w="1294" w:type="dxa"/>
+            <w:tcW w:w="1800" w:type="dxa"/>
             <w:tcBorders>
               <w:top w:val="single" w:sz="4" w:space="0" w:color="000000"/>
               <w:start w:val="single" w:sz="4" w:space="0" w:color="000000"/>
               <w:bottom w:val="single" w:sz="4" w:space="0" w:color="000000"/>
               <w:end w:val="single" w:sz="4" w:space="0" w:color="000000"/>
             </w:tcBorders>
-            <w:vAlign w:val="center"/>
           </w:tcPr>
           <w:p>
-            <w:pPr>
-              <w:pStyle w:val="Normal"/>
-              <w:keepNext w:val="false"/>
-              <w:keepLines w:val="false"/>
-              <w:widowControl/>
-              <w:suppressLineNumbers w:val="0"/>
-              <w:jc w:val="center"/>
-              <w:textAlignment w:val="center"/>
-              <w:rPr>
-                <w:rFonts w:ascii="宋体" w:hAnsi="宋体" w:eastAsia="宋体" w:cs="宋体" w:hint="eastAsia"/>
-                <w:i w:val="false"/>
-                <w:iCs w:val="false"/>
-                <w:color w:val="000000"/>
-                <w:sz w:val="22"/>
-                <w:szCs w:val="22"/>
-                <w:u w:val="none"/>
-              </w:rPr>
-            </w:pPr>
             <w:r>
-              <w:rPr>
-                <w:rFonts w:ascii="宋体" w:hAnsi="宋体" w:cs="宋体" w:hint="eastAsia"/>
-                <w:i w:val="false"/>
-                <w:iCs w:val="false"/>
-                <w:color w:val="000000"/>
-                <w:kern w:val="0"/>
-                <w:sz w:val="22"/>
-                <w:szCs w:val="22"/>
-                <w:u w:val="none"/>
-                <w:lang w:bidi="ar"/>
-              </w:rPr>
-              <w:t>合计</w:t>
+              <w:t xml:space="preserve">{itemName}</w:t>
             </w:r>
           </w:p>
         </w:tc>
         <w:tc>
           <w:tcPr>
-            <w:tcW w:w="1298" w:type="dxa"/>
+            <w:tcW w:w="1800" w:type="dxa"/>
             <w:tcBorders>
               <w:top w:val="single" w:sz="4" w:space="0" w:color="000000"/>
               <w:start w:val="single" w:sz="4" w:space="0" w:color="000000"/>
               <w:bottom w:val="single" w:sz="4" w:space="0" w:color="000000"/>
               <w:end w:val="single" w:sz="4" w:space="0" w:color="000000"/>
             </w:tcBorders>
-            <w:vAlign w:val="center"/>
           </w:tcPr>
           <w:p>
-            <w:pPr>
-              <w:pStyle w:val="Normal"/>
-              <w:keepNext w:val="false"/>
-              <w:keepLines w:val="false"/>
-              <w:widowControl/>
-              <w:suppressLineNumbers w:val="0"/>
-              <w:jc w:val="center"/>
-              <w:textAlignment w:val="center"/>
-              <w:rPr>
-                <w:rFonts w:ascii="宋体" w:hAnsi="宋体" w:eastAsia="宋体" w:cs="宋体" w:hint="eastAsia"/>
-                <w:i w:val="false"/>
-                <w:iCs w:val="false"/>
-                <w:color w:val="000000"/>
-                <w:sz w:val="22"/>
-                <w:szCs w:val="22"/>
-                <w:u w:val="none"/>
-              </w:rPr>
-            </w:pPr>
             <w:r>
-              <w:rPr>
-                <w:rFonts w:ascii="宋体" w:hAnsi="宋体" w:cs="宋体" w:hint="eastAsia"/>
-                <w:i w:val="false"/>
-                <w:iCs w:val="false"/>
-                <w:color w:val="000000"/>
-                <w:kern w:val="0"/>
-                <w:sz w:val="22"/>
-                <w:szCs w:val="22"/>
-                <w:u w:val="none"/>
-                <w:lang w:bidi="ar"/>
-              </w:rPr>
-              <w:t>备注</w:t>
+              <w:t xml:space="preserve">{unit}</w:t>
             </w:r>
           </w:p>
         </w:tc>
-      </w:tr>
-      <w:tr>
-        <w:trPr>
-          <w:trHeight w:val="465" w:hRule="atLeast"/>
-        </w:trPr>
         <w:tc>
           <w:tcPr>
-            <w:tcW w:w="665" w:type="dxa"/>
+            <w:tcW w:w="1800" w:type="dxa"/>
             <w:tcBorders>
               <w:top w:val="single" w:sz="4" w:space="0" w:color="000000"/>
               <w:start w:val="single" w:sz="4" w:space="0" w:color="000000"/>
               <w:bottom w:val="single" w:sz="4" w:space="0" w:color="000000"/>
               <w:end w:val="single" w:sz="4" w:space="0" w:color="000000"/>
             </w:tcBorders>
-            <w:vAlign w:val="center"/>
           </w:tcPr>
           <w:p>
-            <w:pPr>
-              <w:pStyle w:val="Normal"/>
-              <w:keepNext w:val="false"/>
-              <w:keepLines w:val="false"/>
-              <w:widowControl/>
-              <w:suppressLineNumbers w:val="0"/>
-              <w:jc w:val="center"/>
-              <w:textAlignment w:val="center"/>
-              <w:rPr>
-                <w:rFonts w:ascii="宋体" w:hAnsi="宋体" w:eastAsia="宋体" w:cs="宋体" w:hint="eastAsia"/>
-                <w:i w:val="false"/>
-                <w:iCs w:val="false"/>
-                <w:color w:val="000000"/>
-                <w:sz w:val="22"/>
-                <w:szCs w:val="22"/>
-                <w:u w:val="none"/>
-              </w:rPr>
-            </w:pPr>
             <w:r>
-              <w:rPr>
-                <w:rFonts w:eastAsia="宋体" w:cs="宋体" w:hint="eastAsia" w:ascii="宋体" w:hAnsi="宋体"/>
-                <w:i w:val="false"/>
-                <w:iCs w:val="false"/>
-                <w:color w:val="000000"/>
-                <w:kern w:val="0"/>
-                <w:sz w:val="22"/>
-                <w:szCs w:val="22"/>
-                <w:u w:val="none"/>
-                <w:lang w:bidi="ar"/>
-              </w:rPr>
-              <w:t>1</w:t>
+              <w:t xml:space="preserve">{quantity}</w:t>
             </w:r>
           </w:p>
         </w:tc>
         <w:tc>
           <w:tcPr>
-            <w:tcW w:w="2481" w:type="dxa"/>
+            <w:tcW w:w="1800" w:type="dxa"/>
             <w:tcBorders>
               <w:top w:val="single" w:sz="4" w:space="0" w:color="000000"/>
               <w:start w:val="single" w:sz="4" w:space="0" w:color="000000"/>
               <w:bottom w:val="single" w:sz="4" w:space="0" w:color="000000"/>
               <w:end w:val="single" w:sz="4" w:space="0" w:color="000000"/>
             </w:tcBorders>
-            <w:vAlign w:val="center"/>
           </w:tcPr>
           <w:p>
-            <w:pPr>
-              <w:pStyle w:val="Normal"/>
-              <w:keepNext w:val="false"/>
-              <w:keepLines w:val="false"/>
-              <w:widowControl/>
-              <w:suppressLineNumbers w:val="0"/>
-              <w:snapToGrid w:val="false"/>
-              <w:jc w:val="center"/>
-              <w:textAlignment w:val="center"/>
-              <w:rPr>
-                <w:rFonts w:ascii="宋体" w:hAnsi="宋体" w:eastAsia="宋体" w:cs="宋体" w:hint="eastAsia"/>
-                <w:i w:val="false"/>
-                <w:iCs w:val="false"/>
-                <w:color w:val="000000"/>
-                <w:sz w:val="22"/>
-                <w:szCs w:val="22"/>
-                <w:u w:val="none"/>
-              </w:rPr>
-            </w:pPr>
             <w:r>
-              <w:rPr>
-                <w:rFonts w:eastAsia="宋体" w:cs="宋体" w:hint="eastAsia" w:ascii="宋体" w:hAnsi="宋体"/>
-                <w:i w:val="false"/>
-                <w:iCs w:val="false"/>
-                <w:color w:val="000000"/>
-                <w:sz w:val="22"/>
-                <w:szCs w:val="22"/>
-                <w:u w:val="none"/>
-              </w:rPr>
+              <w:t xml:space="preserve">{unitPrice}</w:t>
             </w:r>
           </w:p>
         </w:tc>
         <w:tc>
           <w:tcPr>
-            <w:tcW w:w="1294" w:type="dxa"/>
+            <w:tcW w:w="1800" w:type="dxa"/>
             <w:tcBorders>
               <w:top w:val="single" w:sz="4" w:space="0" w:color="000000"/>
               <w:start w:val="single" w:sz="4" w:space="0" w:color="000000"/>
               <w:bottom w:val="single" w:sz="4" w:space="0" w:color="000000"/>
               <w:end w:val="single" w:sz="4" w:space="0" w:color="000000"/>
             </w:tcBorders>
-            <w:vAlign w:val="center"/>
           </w:tcPr>
           <w:p>
-            <w:pPr>
-              <w:pStyle w:val="Normal"/>
-              <w:keepNext w:val="false"/>
-              <w:keepLines w:val="false"/>
-              <w:widowControl/>
-              <w:suppressLineNumbers w:val="0"/>
-              <w:snapToGrid w:val="false"/>
-              <w:jc w:val="center"/>
-              <w:textAlignment w:val="center"/>
-              <w:rPr>
-                <w:rFonts w:ascii="宋体" w:hAnsi="宋体" w:eastAsia="宋体" w:cs="宋体" w:hint="eastAsia"/>
-                <w:i w:val="false"/>
-                <w:iCs w:val="false"/>
-                <w:color w:val="000000"/>
-                <w:sz w:val="22"/>
-                <w:szCs w:val="22"/>
-                <w:u w:val="none"/>
-              </w:rPr>
-            </w:pPr>
             <w:r>
-              <w:rPr>
-                <w:rFonts w:eastAsia="宋体" w:cs="宋体" w:hint="eastAsia" w:ascii="宋体" w:hAnsi="宋体"/>
-                <w:i w:val="false"/>
-                <w:iCs w:val="false"/>
-                <w:color w:val="000000"/>
-                <w:sz w:val="22"/>
-                <w:szCs w:val="22"/>
-                <w:u w:val="none"/>
-              </w:rPr>
+              <w:t xml:space="preserve">{taxInclusiveAmount}</w:t>
             </w:r>
           </w:p>
         </w:tc>
         <w:tc>
           <w:tcPr>
-            <w:tcW w:w="1294" w:type="dxa"/>
+            <w:tcW w:w="1800" w:type="dxa"/>
             <w:tcBorders>
               <w:top w:val="single" w:sz="4" w:space="0" w:color="000000"/>
               <w:start w:val="single" w:sz="4" w:space="0" w:color="000000"/>
               <w:bottom w:val="single" w:sz="4" w:space="0" w:color="000000"/>
               <w:end w:val="single" w:sz="4" w:space="0" w:color="000000"/>
             </w:tcBorders>
-            <w:vAlign w:val="center"/>
           </w:tcPr>
           <w:p>
-            <w:pPr>
-              <w:pStyle w:val="Normal"/>
-              <w:keepNext w:val="false"/>
-              <w:keepLines w:val="false"/>
-              <w:widowControl/>
-              <w:suppressLineNumbers w:val="0"/>
-              <w:snapToGrid w:val="false"/>
-              <w:jc w:val="center"/>
-              <w:textAlignment w:val="center"/>
-              <w:rPr>
-                <w:rFonts w:ascii="宋体" w:hAnsi="宋体" w:eastAsia="宋体" w:cs="宋体" w:hint="eastAsia"/>
-                <w:i w:val="false"/>
-                <w:iCs w:val="false"/>
-                <w:color w:val="000000"/>
-                <w:sz w:val="22"/>
-                <w:szCs w:val="22"/>
-                <w:u w:val="none"/>
-              </w:rPr>
-            </w:pPr>
             <w:r>
-              <w:rPr>
-                <w:rFonts w:eastAsia="宋体" w:cs="宋体" w:hint="eastAsia" w:ascii="宋体" w:hAnsi="宋体"/>
-                <w:i w:val="false"/>
-                <w:iCs w:val="false"/>
-                <w:color w:val="000000"/>
-                <w:sz w:val="22"/>
-                <w:szCs w:val="22"/>
-                <w:u w:val="none"/>
-              </w:rPr>
-            </w:r>
-          </w:p>
-        </w:tc>
-        <w:tc>
-          <w:tcPr>
-            <w:tcW w:w="1294" w:type="dxa"/>
-            <w:tcBorders>
-              <w:top w:val="single" w:sz="4" w:space="0" w:color="000000"/>
-              <w:start w:val="single" w:sz="4" w:space="0" w:color="000000"/>
-              <w:bottom w:val="single" w:sz="4" w:space="0" w:color="000000"/>
-              <w:end w:val="single" w:sz="4" w:space="0" w:color="000000"/>
-            </w:tcBorders>
-            <w:vAlign w:val="center"/>
-          </w:tcPr>
-          <w:p>
-            <w:pPr>
-              <w:pStyle w:val="Normal"/>
-              <w:keepNext w:val="false"/>
-              <w:keepLines w:val="false"/>
-              <w:widowControl/>
-              <w:suppressLineNumbers w:val="0"/>
-              <w:snapToGrid w:val="false"/>
-              <w:jc w:val="center"/>
-              <w:textAlignment w:val="center"/>
-              <w:rPr>
-                <w:rFonts w:ascii="宋体" w:hAnsi="宋体" w:eastAsia="宋体" w:cs="宋体" w:hint="eastAsia"/>
-                <w:i w:val="false"/>
-                <w:iCs w:val="false"/>
-                <w:color w:val="000000"/>
-                <w:sz w:val="22"/>
-                <w:szCs w:val="22"/>
-                <w:u w:val="none"/>
-              </w:rPr>
-            </w:pPr>
-            <w:r>
-              <w:rPr>
-                <w:rFonts w:eastAsia="宋体" w:cs="宋体" w:hint="eastAsia" w:ascii="宋体" w:hAnsi="宋体"/>
-                <w:i w:val="false"/>
-                <w:iCs w:val="false"/>
-                <w:color w:val="000000"/>
-                <w:sz w:val="22"/>
-                <w:szCs w:val="22"/>
-                <w:u w:val="none"/>
-              </w:rPr>
-            </w:r>
-          </w:p>
-        </w:tc>
-        <w:tc>
-          <w:tcPr>
-            <w:tcW w:w="1294" w:type="dxa"/>
-            <w:tcBorders>
-              <w:top w:val="single" w:sz="4" w:space="0" w:color="000000"/>
-              <w:start w:val="single" w:sz="4" w:space="0" w:color="000000"/>
-              <w:bottom w:val="single" w:sz="4" w:space="0" w:color="000000"/>
-              <w:end w:val="single" w:sz="4" w:space="0" w:color="000000"/>
-            </w:tcBorders>
-            <w:vAlign w:val="center"/>
-          </w:tcPr>
-          <w:p>
-            <w:pPr>
-              <w:pStyle w:val="Normal"/>
-              <w:keepNext w:val="false"/>
-              <w:keepLines w:val="false"/>
-              <w:widowControl/>
-              <w:suppressLineNumbers w:val="0"/>
-              <w:snapToGrid w:val="false"/>
-              <w:jc w:val="center"/>
-              <w:textAlignment w:val="center"/>
-              <w:rPr>
-                <w:rFonts w:ascii="宋体" w:hAnsi="宋体" w:eastAsia="宋体" w:cs="宋体" w:hint="eastAsia"/>
-                <w:i w:val="false"/>
-                <w:iCs w:val="false"/>
-                <w:color w:val="000000"/>
-                <w:sz w:val="22"/>
-                <w:szCs w:val="22"/>
-                <w:u w:val="none"/>
-              </w:rPr>
-            </w:pPr>
-            <w:r>
-              <w:rPr>
-                <w:rFonts w:eastAsia="宋体" w:cs="宋体" w:hint="eastAsia" w:ascii="宋体" w:hAnsi="宋体"/>
-                <w:i w:val="false"/>
-                <w:iCs w:val="false"/>
-                <w:color w:val="000000"/>
-                <w:sz w:val="22"/>
-                <w:szCs w:val="22"/>
-                <w:u w:val="none"/>
-              </w:rPr>
-            </w:r>
-          </w:p>
-        </w:tc>
-        <w:tc>
-          <w:tcPr>
-            <w:tcW w:w="1298" w:type="dxa"/>
-            <w:tcBorders>
-              <w:top w:val="single" w:sz="4" w:space="0" w:color="000000"/>
-              <w:start w:val="single" w:sz="4" w:space="0" w:color="000000"/>
-              <w:bottom w:val="single" w:sz="4" w:space="0" w:color="000000"/>
-              <w:end w:val="single" w:sz="4" w:space="0" w:color="000000"/>
-            </w:tcBorders>
-            <w:vAlign w:val="center"/>
-          </w:tcPr>
-          <w:p>
-            <w:pPr>
-              <w:pStyle w:val="Normal"/>
-              <w:snapToGrid w:val="false"/>
-              <w:jc w:val="center"/>
-              <w:rPr>
-                <w:rFonts w:ascii="宋体" w:hAnsi="宋体" w:eastAsia="宋体" w:cs="宋体" w:hint="eastAsia"/>
-                <w:i w:val="false"/>
-                <w:iCs w:val="false"/>
-                <w:color w:val="000000"/>
-                <w:sz w:val="22"/>
-                <w:szCs w:val="22"/>
-                <w:u w:val="none"/>
-              </w:rPr>
-            </w:pPr>
-            <w:r>
-              <w:rPr>
-                <w:rFonts w:eastAsia="宋体" w:cs="宋体" w:hint="eastAsia" w:ascii="宋体" w:hAnsi="宋体"/>
-                <w:i w:val="false"/>
-                <w:iCs w:val="false"/>
-                <w:color w:val="000000"/>
-                <w:sz w:val="22"/>
-                <w:szCs w:val="22"/>
-                <w:u w:val="none"/>
-              </w:rPr>
-            </w:r>
-          </w:p>
-        </w:tc>
-      </w:tr>
-      <w:tr>
-        <w:trPr>
-          <w:trHeight w:val="465" w:hRule="atLeast"/>
-        </w:trPr>
-        <w:tc>
-          <w:tcPr>
-            <w:tcW w:w="665" w:type="dxa"/>
-            <w:tcBorders>
-              <w:top w:val="single" w:sz="4" w:space="0" w:color="000000"/>
-              <w:start w:val="single" w:sz="4" w:space="0" w:color="000000"/>
-              <w:bottom w:val="single" w:sz="4" w:space="0" w:color="000000"/>
-              <w:end w:val="single" w:sz="4" w:space="0" w:color="000000"/>
-            </w:tcBorders>
-            <w:vAlign w:val="center"/>
-          </w:tcPr>
-          <w:p>
-            <w:pPr>
-              <w:pStyle w:val="Normal"/>
-              <w:keepNext w:val="false"/>
-              <w:keepLines w:val="false"/>
-              <w:widowControl/>
-              <w:suppressLineNumbers w:val="0"/>
-              <w:jc w:val="center"/>
-              <w:textAlignment w:val="center"/>
-              <w:rPr>
-                <w:rFonts w:ascii="宋体" w:hAnsi="宋体" w:eastAsia="宋体" w:cs="宋体" w:hint="eastAsia"/>
-                <w:i w:val="false"/>
-                <w:iCs w:val="false"/>
-                <w:color w:val="000000"/>
-                <w:sz w:val="22"/>
-                <w:szCs w:val="22"/>
-                <w:u w:val="none"/>
-              </w:rPr>
-            </w:pPr>
-            <w:r>
-              <w:rPr>
-                <w:rFonts w:eastAsia="宋体" w:cs="宋体" w:hint="eastAsia" w:ascii="宋体" w:hAnsi="宋体"/>
-                <w:i w:val="false"/>
-                <w:iCs w:val="false"/>
-                <w:color w:val="000000"/>
-                <w:kern w:val="0"/>
-                <w:sz w:val="22"/>
-                <w:szCs w:val="22"/>
-                <w:u w:val="none"/>
-                <w:lang w:bidi="ar"/>
-              </w:rPr>
-              <w:t>2</w:t>
-            </w:r>
-          </w:p>
-        </w:tc>
-        <w:tc>
-          <w:tcPr>
-            <w:tcW w:w="2481" w:type="dxa"/>
-            <w:tcBorders>
-              <w:top w:val="single" w:sz="4" w:space="0" w:color="000000"/>
-              <w:start w:val="single" w:sz="4" w:space="0" w:color="000000"/>
-              <w:bottom w:val="single" w:sz="4" w:space="0" w:color="000000"/>
-              <w:end w:val="single" w:sz="4" w:space="0" w:color="000000"/>
-            </w:tcBorders>
-            <w:vAlign w:val="center"/>
-          </w:tcPr>
-          <w:p>
-            <w:pPr>
-              <w:pStyle w:val="Normal"/>
-              <w:keepNext w:val="false"/>
-              <w:keepLines w:val="false"/>
-              <w:widowControl/>
-              <w:suppressLineNumbers w:val="0"/>
-              <w:snapToGrid w:val="false"/>
-              <w:jc w:val="center"/>
-              <w:textAlignment w:val="center"/>
-              <w:rPr>
-                <w:rFonts w:ascii="宋体" w:hAnsi="宋体" w:eastAsia="宋体" w:cs="宋体" w:hint="eastAsia"/>
-                <w:i w:val="false"/>
-                <w:iCs w:val="false"/>
-                <w:color w:val="000000"/>
-                <w:sz w:val="22"/>
-                <w:szCs w:val="22"/>
-                <w:u w:val="none"/>
-              </w:rPr>
-            </w:pPr>
-            <w:r>
-              <w:rPr>
-                <w:rFonts w:eastAsia="宋体" w:cs="宋体" w:hint="eastAsia" w:ascii="宋体" w:hAnsi="宋体"/>
-                <w:i w:val="false"/>
-                <w:iCs w:val="false"/>
-                <w:color w:val="000000"/>
-                <w:sz w:val="22"/>
-                <w:szCs w:val="22"/>
-                <w:u w:val="none"/>
-              </w:rPr>
-            </w:r>
-          </w:p>
-        </w:tc>
-        <w:tc>
-          <w:tcPr>
-            <w:tcW w:w="1294" w:type="dxa"/>
-            <w:tcBorders>
-              <w:top w:val="single" w:sz="4" w:space="0" w:color="000000"/>
-              <w:start w:val="single" w:sz="4" w:space="0" w:color="000000"/>
-              <w:bottom w:val="single" w:sz="4" w:space="0" w:color="000000"/>
-              <w:end w:val="single" w:sz="4" w:space="0" w:color="000000"/>
-            </w:tcBorders>
-            <w:vAlign w:val="center"/>
-          </w:tcPr>
-          <w:p>
-            <w:pPr>
-              <w:pStyle w:val="Normal"/>
-              <w:keepNext w:val="false"/>
-              <w:keepLines w:val="false"/>
-              <w:widowControl/>
-              <w:suppressLineNumbers w:val="0"/>
-              <w:snapToGrid w:val="false"/>
-              <w:jc w:val="center"/>
-              <w:textAlignment w:val="center"/>
-              <w:rPr>
-                <w:rFonts w:ascii="宋体" w:hAnsi="宋体" w:eastAsia="宋体" w:cs="宋体" w:hint="eastAsia"/>
-                <w:i w:val="false"/>
-                <w:iCs w:val="false"/>
-                <w:color w:val="000000"/>
-                <w:sz w:val="22"/>
-                <w:szCs w:val="22"/>
-                <w:u w:val="none"/>
-              </w:rPr>
-            </w:pPr>
-            <w:r>
-              <w:rPr>
-                <w:rFonts w:eastAsia="宋体" w:cs="宋体" w:hint="eastAsia" w:ascii="宋体" w:hAnsi="宋体"/>
-                <w:i w:val="false"/>
-                <w:iCs w:val="false"/>
-                <w:color w:val="000000"/>
-                <w:sz w:val="22"/>
-                <w:szCs w:val="22"/>
-                <w:u w:val="none"/>
-              </w:rPr>
-            </w:r>
-          </w:p>
-        </w:tc>
-        <w:tc>
-          <w:tcPr>
-            <w:tcW w:w="1294" w:type="dxa"/>
-            <w:tcBorders>
-              <w:top w:val="single" w:sz="4" w:space="0" w:color="000000"/>
-              <w:start w:val="single" w:sz="4" w:space="0" w:color="000000"/>
-              <w:bottom w:val="single" w:sz="4" w:space="0" w:color="000000"/>
-              <w:end w:val="single" w:sz="4" w:space="0" w:color="000000"/>
-            </w:tcBorders>
-            <w:vAlign w:val="center"/>
-          </w:tcPr>
-          <w:p>
-            <w:pPr>
-              <w:pStyle w:val="Normal"/>
-              <w:keepNext w:val="false"/>
-              <w:keepLines w:val="false"/>
-              <w:widowControl/>
-              <w:suppressLineNumbers w:val="0"/>
-              <w:snapToGrid w:val="false"/>
-              <w:jc w:val="center"/>
-              <w:textAlignment w:val="center"/>
-              <w:rPr>
-                <w:rFonts w:ascii="宋体" w:hAnsi="宋体" w:eastAsia="宋体" w:cs="宋体" w:hint="eastAsia"/>
-                <w:i w:val="false"/>
-                <w:iCs w:val="false"/>
-                <w:color w:val="000000"/>
-                <w:sz w:val="22"/>
-                <w:szCs w:val="22"/>
-                <w:u w:val="none"/>
-              </w:rPr>
-            </w:pPr>
-            <w:r>
-              <w:rPr>
-                <w:rFonts w:eastAsia="宋体" w:cs="宋体" w:hint="eastAsia" w:ascii="宋体" w:hAnsi="宋体"/>
-                <w:i w:val="false"/>
-                <w:iCs w:val="false"/>
-                <w:color w:val="000000"/>
-                <w:sz w:val="22"/>
-                <w:szCs w:val="22"/>
-                <w:u w:val="none"/>
-              </w:rPr>
-            </w:r>
-          </w:p>
-        </w:tc>
-        <w:tc>
-          <w:tcPr>
-            <w:tcW w:w="1294" w:type="dxa"/>
-            <w:tcBorders>
-              <w:top w:val="single" w:sz="4" w:space="0" w:color="000000"/>
-              <w:start w:val="single" w:sz="4" w:space="0" w:color="000000"/>
-              <w:bottom w:val="single" w:sz="4" w:space="0" w:color="000000"/>
-              <w:end w:val="single" w:sz="4" w:space="0" w:color="000000"/>
-            </w:tcBorders>
-            <w:vAlign w:val="center"/>
-          </w:tcPr>
-          <w:p>
-            <w:pPr>
-              <w:pStyle w:val="Normal"/>
-              <w:keepNext w:val="false"/>
-              <w:keepLines w:val="false"/>
-              <w:widowControl/>
-              <w:suppressLineNumbers w:val="0"/>
-              <w:snapToGrid w:val="false"/>
-              <w:jc w:val="center"/>
-              <w:textAlignment w:val="center"/>
-              <w:rPr>
-                <w:rFonts w:ascii="宋体" w:hAnsi="宋体" w:eastAsia="宋体" w:cs="宋体" w:hint="eastAsia"/>
-                <w:i w:val="false"/>
-                <w:iCs w:val="false"/>
-                <w:color w:val="000000"/>
-                <w:sz w:val="22"/>
-                <w:szCs w:val="22"/>
-                <w:u w:val="none"/>
-              </w:rPr>
-            </w:pPr>
-            <w:r>
-              <w:rPr>
-                <w:rFonts w:eastAsia="宋体" w:cs="宋体" w:hint="eastAsia" w:ascii="宋体" w:hAnsi="宋体"/>
-                <w:i w:val="false"/>
-                <w:iCs w:val="false"/>
-                <w:color w:val="000000"/>
-                <w:sz w:val="22"/>
-                <w:szCs w:val="22"/>
-                <w:u w:val="none"/>
-              </w:rPr>
-            </w:r>
-          </w:p>
-        </w:tc>
-        <w:tc>
-          <w:tcPr>
-            <w:tcW w:w="1294" w:type="dxa"/>
-            <w:tcBorders>
-              <w:top w:val="single" w:sz="4" w:space="0" w:color="000000"/>
-              <w:start w:val="single" w:sz="4" w:space="0" w:color="000000"/>
-              <w:bottom w:val="single" w:sz="4" w:space="0" w:color="000000"/>
-              <w:end w:val="single" w:sz="4" w:space="0" w:color="000000"/>
-            </w:tcBorders>
-            <w:vAlign w:val="center"/>
-          </w:tcPr>
-          <w:p>
-            <w:pPr>
-              <w:pStyle w:val="Normal"/>
-              <w:keepNext w:val="false"/>
-              <w:keepLines w:val="false"/>
-              <w:widowControl/>
-              <w:suppressLineNumbers w:val="0"/>
-              <w:snapToGrid w:val="false"/>
-              <w:jc w:val="center"/>
-              <w:textAlignment w:val="center"/>
-              <w:rPr>
-                <w:rFonts w:ascii="宋体" w:hAnsi="宋体" w:eastAsia="宋体" w:cs="宋体" w:hint="eastAsia"/>
-                <w:i w:val="false"/>
-                <w:iCs w:val="false"/>
-                <w:color w:val="000000"/>
-                <w:sz w:val="22"/>
-                <w:szCs w:val="22"/>
-                <w:u w:val="none"/>
-              </w:rPr>
-            </w:pPr>
-            <w:r>
-              <w:rPr>
-                <w:rFonts w:eastAsia="宋体" w:cs="宋体" w:hint="eastAsia" w:ascii="宋体" w:hAnsi="宋体"/>
-                <w:i w:val="false"/>
-                <w:iCs w:val="false"/>
-                <w:color w:val="000000"/>
-                <w:sz w:val="22"/>
-                <w:szCs w:val="22"/>
-                <w:u w:val="none"/>
-              </w:rPr>
-            </w:r>
-          </w:p>
-        </w:tc>
-        <w:tc>
-          <w:tcPr>
-            <w:tcW w:w="1298" w:type="dxa"/>
-            <w:tcBorders>
-              <w:top w:val="single" w:sz="4" w:space="0" w:color="000000"/>
-              <w:start w:val="single" w:sz="4" w:space="0" w:color="000000"/>
-              <w:bottom w:val="single" w:sz="4" w:space="0" w:color="000000"/>
-              <w:end w:val="single" w:sz="4" w:space="0" w:color="000000"/>
-            </w:tcBorders>
-            <w:vAlign w:val="center"/>
-          </w:tcPr>
-          <w:p>
-            <w:pPr>
-              <w:pStyle w:val="Normal"/>
-              <w:snapToGrid w:val="false"/>
-              <w:jc w:val="center"/>
-              <w:rPr>
-                <w:rFonts w:ascii="宋体" w:hAnsi="宋体" w:eastAsia="宋体" w:cs="宋体" w:hint="eastAsia"/>
-                <w:i w:val="false"/>
-                <w:iCs w:val="false"/>
-                <w:color w:val="000000"/>
-                <w:sz w:val="22"/>
-                <w:szCs w:val="22"/>
-                <w:u w:val="none"/>
-              </w:rPr>
-            </w:pPr>
-            <w:r>
-              <w:rPr>
-                <w:rFonts w:eastAsia="宋体" w:cs="宋体" w:hint="eastAsia" w:ascii="宋体" w:hAnsi="宋体"/>
-                <w:i w:val="false"/>
-                <w:iCs w:val="false"/>
-                <w:color w:val="000000"/>
-                <w:sz w:val="22"/>
-                <w:szCs w:val="22"/>
-                <w:u w:val="none"/>
-              </w:rPr>
-            </w:r>
-          </w:p>
-        </w:tc>
-      </w:tr>
-      <w:tr>
-        <w:trPr>
-          <w:trHeight w:val="465" w:hRule="atLeast"/>
-        </w:trPr>
-        <w:tc>
-          <w:tcPr>
-            <w:tcW w:w="665" w:type="dxa"/>
-            <w:tcBorders>
-              <w:top w:val="single" w:sz="4" w:space="0" w:color="000000"/>
-              <w:start w:val="single" w:sz="4" w:space="0" w:color="000000"/>
-              <w:bottom w:val="single" w:sz="4" w:space="0" w:color="000000"/>
-              <w:end w:val="single" w:sz="4" w:space="0" w:color="000000"/>
-            </w:tcBorders>
-            <w:vAlign w:val="center"/>
-          </w:tcPr>
-          <w:p>
-            <w:pPr>
-              <w:pStyle w:val="Normal"/>
-              <w:keepNext w:val="false"/>
-              <w:keepLines w:val="false"/>
-              <w:widowControl/>
-              <w:suppressLineNumbers w:val="0"/>
-              <w:jc w:val="center"/>
-              <w:textAlignment w:val="center"/>
-              <w:rPr>
-                <w:rFonts w:ascii="宋体" w:hAnsi="宋体" w:eastAsia="宋体" w:cs="宋体" w:hint="eastAsia"/>
-                <w:i w:val="false"/>
-                <w:iCs w:val="false"/>
-                <w:color w:val="000000"/>
-                <w:sz w:val="22"/>
-                <w:szCs w:val="22"/>
-                <w:u w:val="none"/>
-              </w:rPr>
-            </w:pPr>
-            <w:r>
-              <w:rPr>
-                <w:rFonts w:eastAsia="宋体" w:cs="宋体" w:hint="eastAsia" w:ascii="宋体" w:hAnsi="宋体"/>
-                <w:i w:val="false"/>
-                <w:iCs w:val="false"/>
-                <w:color w:val="000000"/>
-                <w:kern w:val="0"/>
-                <w:sz w:val="22"/>
-                <w:szCs w:val="22"/>
-                <w:u w:val="none"/>
-                <w:lang w:bidi="ar"/>
-              </w:rPr>
-              <w:t>3</w:t>
-            </w:r>
-          </w:p>
-        </w:tc>
-        <w:tc>
-          <w:tcPr>
-            <w:tcW w:w="2481" w:type="dxa"/>
-            <w:tcBorders>
-              <w:top w:val="single" w:sz="4" w:space="0" w:color="000000"/>
-              <w:start w:val="single" w:sz="4" w:space="0" w:color="000000"/>
-              <w:bottom w:val="single" w:sz="4" w:space="0" w:color="000000"/>
-              <w:end w:val="single" w:sz="4" w:space="0" w:color="000000"/>
-            </w:tcBorders>
-            <w:vAlign w:val="center"/>
-          </w:tcPr>
-          <w:p>
-            <w:pPr>
-              <w:pStyle w:val="Normal"/>
-              <w:keepNext w:val="false"/>
-              <w:keepLines w:val="false"/>
-              <w:widowControl/>
-              <w:suppressLineNumbers w:val="0"/>
-              <w:snapToGrid w:val="false"/>
-              <w:jc w:val="center"/>
-              <w:textAlignment w:val="center"/>
-              <w:rPr>
-                <w:rFonts w:ascii="宋体" w:hAnsi="宋体" w:eastAsia="宋体" w:cs="宋体" w:hint="eastAsia"/>
-                <w:i w:val="false"/>
-                <w:iCs w:val="false"/>
-                <w:color w:val="000000"/>
-                <w:sz w:val="22"/>
-                <w:szCs w:val="22"/>
-                <w:u w:val="none"/>
-              </w:rPr>
-            </w:pPr>
-            <w:r>
-              <w:rPr>
-                <w:rFonts w:eastAsia="宋体" w:cs="宋体" w:hint="eastAsia" w:ascii="宋体" w:hAnsi="宋体"/>
-                <w:i w:val="false"/>
-                <w:iCs w:val="false"/>
-                <w:color w:val="000000"/>
-                <w:sz w:val="22"/>
-                <w:szCs w:val="22"/>
-                <w:u w:val="none"/>
-              </w:rPr>
-            </w:r>
-          </w:p>
-        </w:tc>
-        <w:tc>
-          <w:tcPr>
-            <w:tcW w:w="1294" w:type="dxa"/>
-            <w:tcBorders>
-              <w:top w:val="single" w:sz="4" w:space="0" w:color="000000"/>
-              <w:start w:val="single" w:sz="4" w:space="0" w:color="000000"/>
-              <w:bottom w:val="single" w:sz="4" w:space="0" w:color="000000"/>
-              <w:end w:val="single" w:sz="4" w:space="0" w:color="000000"/>
-            </w:tcBorders>
-            <w:vAlign w:val="center"/>
-          </w:tcPr>
-          <w:p>
-            <w:pPr>
-              <w:pStyle w:val="Normal"/>
-              <w:keepNext w:val="false"/>
-              <w:keepLines w:val="false"/>
-              <w:widowControl/>
-              <w:suppressLineNumbers w:val="0"/>
-              <w:snapToGrid w:val="false"/>
-              <w:jc w:val="center"/>
-              <w:textAlignment w:val="center"/>
-              <w:rPr>
-                <w:rFonts w:ascii="宋体" w:hAnsi="宋体" w:eastAsia="宋体" w:cs="宋体" w:hint="eastAsia"/>
-                <w:i w:val="false"/>
-                <w:iCs w:val="false"/>
-                <w:color w:val="000000"/>
-                <w:sz w:val="22"/>
-                <w:szCs w:val="22"/>
-                <w:u w:val="none"/>
-              </w:rPr>
-            </w:pPr>
-            <w:r>
-              <w:rPr>
-                <w:rFonts w:eastAsia="宋体" w:cs="宋体" w:hint="eastAsia" w:ascii="宋体" w:hAnsi="宋体"/>
-                <w:i w:val="false"/>
-                <w:iCs w:val="false"/>
-                <w:color w:val="000000"/>
-                <w:sz w:val="22"/>
-                <w:szCs w:val="22"/>
-                <w:u w:val="none"/>
-              </w:rPr>
-            </w:r>
-          </w:p>
-        </w:tc>
-        <w:tc>
-          <w:tcPr>
-            <w:tcW w:w="1294" w:type="dxa"/>
-            <w:tcBorders>
-              <w:top w:val="single" w:sz="4" w:space="0" w:color="000000"/>
-              <w:start w:val="single" w:sz="4" w:space="0" w:color="000000"/>
-              <w:bottom w:val="single" w:sz="4" w:space="0" w:color="000000"/>
-              <w:end w:val="single" w:sz="4" w:space="0" w:color="000000"/>
-            </w:tcBorders>
-            <w:vAlign w:val="center"/>
-          </w:tcPr>
-          <w:p>
-            <w:pPr>
-              <w:pStyle w:val="Normal"/>
-              <w:keepNext w:val="false"/>
-              <w:keepLines w:val="false"/>
-              <w:widowControl/>
-              <w:suppressLineNumbers w:val="0"/>
-              <w:snapToGrid w:val="false"/>
-              <w:jc w:val="center"/>
-              <w:textAlignment w:val="center"/>
-              <w:rPr>
-                <w:rFonts w:ascii="宋体" w:hAnsi="宋体" w:eastAsia="宋体" w:cs="宋体" w:hint="eastAsia"/>
-                <w:i w:val="false"/>
-                <w:iCs w:val="false"/>
-                <w:color w:val="000000"/>
-                <w:sz w:val="22"/>
-                <w:szCs w:val="22"/>
-                <w:u w:val="none"/>
-              </w:rPr>
-            </w:pPr>
-            <w:r>
-              <w:rPr>
-                <w:rFonts w:eastAsia="宋体" w:cs="宋体" w:hint="eastAsia" w:ascii="宋体" w:hAnsi="宋体"/>
-                <w:i w:val="false"/>
-                <w:iCs w:val="false"/>
-                <w:color w:val="000000"/>
-                <w:sz w:val="22"/>
-                <w:szCs w:val="22"/>
-                <w:u w:val="none"/>
-              </w:rPr>
-            </w:r>
-          </w:p>
-        </w:tc>
-        <w:tc>
-          <w:tcPr>
-            <w:tcW w:w="1294" w:type="dxa"/>
-            <w:tcBorders>
-              <w:top w:val="single" w:sz="4" w:space="0" w:color="000000"/>
-              <w:start w:val="single" w:sz="4" w:space="0" w:color="000000"/>
-              <w:bottom w:val="single" w:sz="4" w:space="0" w:color="000000"/>
-              <w:end w:val="single" w:sz="4" w:space="0" w:color="000000"/>
-            </w:tcBorders>
-            <w:vAlign w:val="center"/>
-          </w:tcPr>
-          <w:p>
-            <w:pPr>
-              <w:pStyle w:val="Normal"/>
-              <w:keepNext w:val="false"/>
-              <w:keepLines w:val="false"/>
-              <w:widowControl/>
-              <w:suppressLineNumbers w:val="0"/>
-              <w:snapToGrid w:val="false"/>
-              <w:jc w:val="center"/>
-              <w:textAlignment w:val="center"/>
-              <w:rPr>
-                <w:rFonts w:ascii="宋体" w:hAnsi="宋体" w:eastAsia="宋体" w:cs="宋体" w:hint="eastAsia"/>
-                <w:i w:val="false"/>
-                <w:iCs w:val="false"/>
-                <w:color w:val="000000"/>
-                <w:sz w:val="22"/>
-                <w:szCs w:val="22"/>
-                <w:u w:val="none"/>
-              </w:rPr>
-            </w:pPr>
-            <w:r>
-              <w:rPr>
-                <w:rFonts w:eastAsia="宋体" w:cs="宋体" w:hint="eastAsia" w:ascii="宋体" w:hAnsi="宋体"/>
-                <w:i w:val="false"/>
-                <w:iCs w:val="false"/>
-                <w:color w:val="000000"/>
-                <w:sz w:val="22"/>
-                <w:szCs w:val="22"/>
-                <w:u w:val="none"/>
-              </w:rPr>
-            </w:r>
-          </w:p>
-        </w:tc>
-        <w:tc>
-          <w:tcPr>
-            <w:tcW w:w="1294" w:type="dxa"/>
-            <w:tcBorders>
-              <w:top w:val="single" w:sz="4" w:space="0" w:color="000000"/>
-              <w:start w:val="single" w:sz="4" w:space="0" w:color="000000"/>
-              <w:bottom w:val="single" w:sz="4" w:space="0" w:color="000000"/>
-              <w:end w:val="single" w:sz="4" w:space="0" w:color="000000"/>
-            </w:tcBorders>
-            <w:vAlign w:val="center"/>
-          </w:tcPr>
-          <w:p>
-            <w:pPr>
-              <w:pStyle w:val="Normal"/>
-              <w:keepNext w:val="false"/>
-              <w:keepLines w:val="false"/>
-              <w:widowControl/>
-              <w:suppressLineNumbers w:val="0"/>
-              <w:snapToGrid w:val="false"/>
-              <w:jc w:val="center"/>
-              <w:textAlignment w:val="center"/>
-              <w:rPr>
-                <w:rFonts w:ascii="宋体" w:hAnsi="宋体" w:eastAsia="宋体" w:cs="宋体" w:hint="eastAsia"/>
-                <w:i w:val="false"/>
-                <w:iCs w:val="false"/>
-                <w:color w:val="000000"/>
-                <w:sz w:val="22"/>
-                <w:szCs w:val="22"/>
-                <w:u w:val="none"/>
-              </w:rPr>
-            </w:pPr>
-            <w:r>
-              <w:rPr>
-                <w:rFonts w:eastAsia="宋体" w:cs="宋体" w:hint="eastAsia" w:ascii="宋体" w:hAnsi="宋体"/>
-                <w:i w:val="false"/>
-                <w:iCs w:val="false"/>
-                <w:color w:val="000000"/>
-                <w:sz w:val="22"/>
-                <w:szCs w:val="22"/>
-                <w:u w:val="none"/>
-              </w:rPr>
-            </w:r>
-          </w:p>
-        </w:tc>
-        <w:tc>
-          <w:tcPr>
-            <w:tcW w:w="1298" w:type="dxa"/>
-            <w:tcBorders>
-              <w:top w:val="single" w:sz="4" w:space="0" w:color="000000"/>
-              <w:start w:val="single" w:sz="4" w:space="0" w:color="000000"/>
-              <w:bottom w:val="single" w:sz="4" w:space="0" w:color="000000"/>
-              <w:end w:val="single" w:sz="4" w:space="0" w:color="000000"/>
-            </w:tcBorders>
-            <w:vAlign w:val="center"/>
-          </w:tcPr>
-          <w:p>
-            <w:pPr>
-              <w:pStyle w:val="Normal"/>
-              <w:snapToGrid w:val="false"/>
-              <w:jc w:val="center"/>
-              <w:rPr>
-                <w:rFonts w:ascii="宋体" w:hAnsi="宋体" w:eastAsia="宋体" w:cs="宋体" w:hint="eastAsia"/>
-                <w:i w:val="false"/>
-                <w:iCs w:val="false"/>
-                <w:color w:val="000000"/>
-                <w:sz w:val="22"/>
-                <w:szCs w:val="22"/>
-                <w:u w:val="none"/>
-              </w:rPr>
-            </w:pPr>
-            <w:r>
-              <w:rPr>
-                <w:rFonts w:eastAsia="宋体" w:cs="宋体" w:hint="eastAsia" w:ascii="宋体" w:hAnsi="宋体"/>
-                <w:i w:val="false"/>
-                <w:iCs w:val="false"/>
-                <w:color w:val="000000"/>
-                <w:sz w:val="22"/>
-                <w:szCs w:val="22"/>
-                <w:u w:val="none"/>
-              </w:rPr>
-            </w:r>
-          </w:p>
-        </w:tc>
-      </w:tr>
-      <w:tr>
-        <w:trPr>
-          <w:trHeight w:val="425" w:hRule="atLeast"/>
-        </w:trPr>
-        <w:tc>
-          <w:tcPr>
-            <w:tcW w:w="665" w:type="dxa"/>
-            <w:tcBorders>
-              <w:top w:val="single" w:sz="4" w:space="0" w:color="000000"/>
-              <w:start w:val="single" w:sz="4" w:space="0" w:color="000000"/>
-              <w:bottom w:val="single" w:sz="4" w:space="0" w:color="000000"/>
-              <w:end w:val="single" w:sz="4" w:space="0" w:color="000000"/>
-            </w:tcBorders>
-            <w:vAlign w:val="center"/>
-          </w:tcPr>
-          <w:p>
-            <w:pPr>
-              <w:pStyle w:val="Normal"/>
-              <w:snapToGrid w:val="false"/>
-              <w:jc w:val="center"/>
-              <w:rPr>
-                <w:rFonts w:ascii="宋体" w:hAnsi="宋体" w:eastAsia="宋体" w:cs="宋体" w:hint="eastAsia"/>
-                <w:i w:val="false"/>
-                <w:iCs w:val="false"/>
-                <w:color w:val="000000"/>
-                <w:sz w:val="22"/>
-                <w:szCs w:val="22"/>
-                <w:u w:val="none"/>
-              </w:rPr>
-            </w:pPr>
-            <w:r>
-              <w:rPr>
-                <w:rFonts w:eastAsia="宋体" w:cs="宋体" w:hint="eastAsia" w:ascii="宋体" w:hAnsi="宋体"/>
-                <w:i w:val="false"/>
-                <w:iCs w:val="false"/>
-                <w:color w:val="000000"/>
-                <w:sz w:val="22"/>
-                <w:szCs w:val="22"/>
-                <w:u w:val="none"/>
-              </w:rPr>
-            </w:r>
-          </w:p>
-        </w:tc>
-        <w:tc>
-          <w:tcPr>
-            <w:tcW w:w="2481" w:type="dxa"/>
-            <w:tcBorders>
-              <w:top w:val="single" w:sz="4" w:space="0" w:color="000000"/>
-              <w:start w:val="single" w:sz="4" w:space="0" w:color="000000"/>
-              <w:bottom w:val="single" w:sz="4" w:space="0" w:color="000000"/>
-              <w:end w:val="single" w:sz="4" w:space="0" w:color="000000"/>
-            </w:tcBorders>
-            <w:vAlign w:val="center"/>
-          </w:tcPr>
-          <w:p>
-            <w:pPr>
-              <w:pStyle w:val="Normal"/>
-              <w:snapToGrid w:val="false"/>
-              <w:jc w:val="center"/>
-              <w:rPr>
-                <w:rFonts w:ascii="宋体" w:hAnsi="宋体" w:eastAsia="宋体" w:cs="宋体" w:hint="eastAsia"/>
-                <w:i w:val="false"/>
-                <w:iCs w:val="false"/>
-                <w:color w:val="000000"/>
-                <w:sz w:val="22"/>
-                <w:szCs w:val="22"/>
-                <w:u w:val="none"/>
-              </w:rPr>
-            </w:pPr>
-            <w:r>
-              <w:rPr>
-                <w:rFonts w:eastAsia="宋体" w:cs="宋体" w:hint="eastAsia" w:ascii="宋体" w:hAnsi="宋体"/>
-                <w:i w:val="false"/>
-                <w:iCs w:val="false"/>
-                <w:color w:val="000000"/>
-                <w:sz w:val="22"/>
-                <w:szCs w:val="22"/>
-                <w:u w:val="none"/>
-              </w:rPr>
-            </w:r>
-          </w:p>
-        </w:tc>
-        <w:tc>
-          <w:tcPr>
-            <w:tcW w:w="1294" w:type="dxa"/>
-            <w:tcBorders>
-              <w:top w:val="single" w:sz="4" w:space="0" w:color="000000"/>
-              <w:start w:val="single" w:sz="4" w:space="0" w:color="000000"/>
-              <w:bottom w:val="single" w:sz="4" w:space="0" w:color="000000"/>
-              <w:end w:val="single" w:sz="4" w:space="0" w:color="000000"/>
-            </w:tcBorders>
-            <w:vAlign w:val="center"/>
-          </w:tcPr>
-          <w:p>
-            <w:pPr>
-              <w:pStyle w:val="Normal"/>
-              <w:snapToGrid w:val="false"/>
-              <w:jc w:val="center"/>
-              <w:rPr>
-                <w:rFonts w:ascii="宋体" w:hAnsi="宋体" w:eastAsia="宋体" w:cs="宋体" w:hint="eastAsia"/>
-                <w:i w:val="false"/>
-                <w:iCs w:val="false"/>
-                <w:color w:val="000000"/>
-                <w:sz w:val="22"/>
-                <w:szCs w:val="22"/>
-                <w:u w:val="none"/>
-              </w:rPr>
-            </w:pPr>
-            <w:r>
-              <w:rPr>
-                <w:rFonts w:eastAsia="宋体" w:cs="宋体" w:hint="eastAsia" w:ascii="宋体" w:hAnsi="宋体"/>
-                <w:i w:val="false"/>
-                <w:iCs w:val="false"/>
-                <w:color w:val="000000"/>
-                <w:sz w:val="22"/>
-                <w:szCs w:val="22"/>
-                <w:u w:val="none"/>
-              </w:rPr>
-            </w:r>
-          </w:p>
-        </w:tc>
-        <w:tc>
-          <w:tcPr>
-            <w:tcW w:w="1294" w:type="dxa"/>
-            <w:tcBorders>
-              <w:top w:val="single" w:sz="4" w:space="0" w:color="000000"/>
-              <w:start w:val="single" w:sz="4" w:space="0" w:color="000000"/>
-              <w:bottom w:val="single" w:sz="4" w:space="0" w:color="000000"/>
-              <w:end w:val="single" w:sz="4" w:space="0" w:color="000000"/>
-            </w:tcBorders>
-            <w:vAlign w:val="center"/>
-          </w:tcPr>
-          <w:p>
-            <w:pPr>
-              <w:pStyle w:val="Normal"/>
-              <w:snapToGrid w:val="false"/>
-              <w:jc w:val="center"/>
-              <w:rPr>
-                <w:rFonts w:ascii="宋体" w:hAnsi="宋体" w:eastAsia="宋体" w:cs="宋体" w:hint="eastAsia"/>
-                <w:i w:val="false"/>
-                <w:iCs w:val="false"/>
-                <w:color w:val="000000"/>
-                <w:sz w:val="22"/>
-                <w:szCs w:val="22"/>
-                <w:u w:val="none"/>
-              </w:rPr>
-            </w:pPr>
-            <w:r>
-              <w:rPr>
-                <w:rFonts w:eastAsia="宋体" w:cs="宋体" w:hint="eastAsia" w:ascii="宋体" w:hAnsi="宋体"/>
-                <w:i w:val="false"/>
-                <w:iCs w:val="false"/>
-                <w:color w:val="000000"/>
-                <w:sz w:val="22"/>
-                <w:szCs w:val="22"/>
-                <w:u w:val="none"/>
-              </w:rPr>
-            </w:r>
-          </w:p>
-        </w:tc>
-        <w:tc>
-          <w:tcPr>
-            <w:tcW w:w="1294" w:type="dxa"/>
-            <w:tcBorders>
-              <w:top w:val="single" w:sz="4" w:space="0" w:color="000000"/>
-              <w:start w:val="single" w:sz="4" w:space="0" w:color="000000"/>
-              <w:bottom w:val="single" w:sz="4" w:space="0" w:color="000000"/>
-              <w:end w:val="single" w:sz="4" w:space="0" w:color="000000"/>
-            </w:tcBorders>
-            <w:vAlign w:val="center"/>
-          </w:tcPr>
-          <w:p>
-            <w:pPr>
-              <w:pStyle w:val="Normal"/>
-              <w:snapToGrid w:val="false"/>
-              <w:jc w:val="center"/>
-              <w:rPr>
-                <w:rFonts w:ascii="宋体" w:hAnsi="宋体" w:eastAsia="宋体" w:cs="宋体" w:hint="eastAsia"/>
-                <w:i w:val="false"/>
-                <w:iCs w:val="false"/>
-                <w:color w:val="000000"/>
-                <w:sz w:val="22"/>
-                <w:szCs w:val="22"/>
-                <w:u w:val="none"/>
-              </w:rPr>
-            </w:pPr>
-            <w:r>
-              <w:rPr>
-                <w:rFonts w:eastAsia="宋体" w:cs="宋体" w:hint="eastAsia" w:ascii="宋体" w:hAnsi="宋体"/>
-                <w:i w:val="false"/>
-                <w:iCs w:val="false"/>
-                <w:color w:val="000000"/>
-                <w:sz w:val="22"/>
-                <w:szCs w:val="22"/>
-                <w:u w:val="none"/>
-              </w:rPr>
-            </w:r>
-          </w:p>
-        </w:tc>
-        <w:tc>
-          <w:tcPr>
-            <w:tcW w:w="1294" w:type="dxa"/>
-            <w:tcBorders>
-              <w:top w:val="single" w:sz="4" w:space="0" w:color="000000"/>
-              <w:start w:val="single" w:sz="4" w:space="0" w:color="000000"/>
-              <w:bottom w:val="single" w:sz="4" w:space="0" w:color="000000"/>
-              <w:end w:val="single" w:sz="4" w:space="0" w:color="000000"/>
-            </w:tcBorders>
-            <w:vAlign w:val="center"/>
-          </w:tcPr>
-          <w:p>
-            <w:pPr>
-              <w:pStyle w:val="Normal"/>
-              <w:snapToGrid w:val="false"/>
-              <w:jc w:val="center"/>
-              <w:rPr>
-                <w:rFonts w:ascii="宋体" w:hAnsi="宋体" w:eastAsia="宋体" w:cs="宋体" w:hint="eastAsia"/>
-                <w:i w:val="false"/>
-                <w:iCs w:val="false"/>
-                <w:color w:val="000000"/>
-                <w:sz w:val="22"/>
-                <w:szCs w:val="22"/>
-                <w:u w:val="none"/>
-              </w:rPr>
-            </w:pPr>
-            <w:r>
-              <w:rPr>
-                <w:rFonts w:eastAsia="宋体" w:cs="宋体" w:hint="eastAsia" w:ascii="宋体" w:hAnsi="宋体"/>
-                <w:i w:val="false"/>
-                <w:iCs w:val="false"/>
-                <w:color w:val="000000"/>
-                <w:sz w:val="22"/>
-                <w:szCs w:val="22"/>
-                <w:u w:val="none"/>
-              </w:rPr>
-            </w:r>
-          </w:p>
-        </w:tc>
-        <w:tc>
-          <w:tcPr>
-            <w:tcW w:w="1298" w:type="dxa"/>
-            <w:tcBorders>
-              <w:top w:val="single" w:sz="4" w:space="0" w:color="000000"/>
-              <w:start w:val="single" w:sz="4" w:space="0" w:color="000000"/>
-              <w:bottom w:val="single" w:sz="4" w:space="0" w:color="000000"/>
-              <w:end w:val="single" w:sz="4" w:space="0" w:color="000000"/>
-            </w:tcBorders>
-            <w:vAlign w:val="center"/>
-          </w:tcPr>
-          <w:p>
-            <w:pPr>
-              <w:pStyle w:val="Normal"/>
-              <w:snapToGrid w:val="false"/>
-              <w:jc w:val="center"/>
-              <w:rPr>
-                <w:rFonts w:ascii="宋体" w:hAnsi="宋体" w:eastAsia="宋体" w:cs="宋体" w:hint="eastAsia"/>
-                <w:i w:val="false"/>
-                <w:iCs w:val="false"/>
-                <w:color w:val="000000"/>
-                <w:sz w:val="22"/>
-                <w:szCs w:val="22"/>
-                <w:u w:val="none"/>
-              </w:rPr>
-            </w:pPr>
-            <w:r>
-              <w:rPr>
-                <w:rFonts w:eastAsia="宋体" w:cs="宋体" w:hint="eastAsia" w:ascii="宋体" w:hAnsi="宋体"/>
-                <w:i w:val="false"/>
-                <w:iCs w:val="false"/>
-                <w:color w:val="000000"/>
-                <w:sz w:val="22"/>
-                <w:szCs w:val="22"/>
-                <w:u w:val="none"/>
-              </w:rPr>
-            </w:r>
-          </w:p>
-        </w:tc>
-      </w:tr>
-      <w:tr>
-        <w:trPr>
-          <w:trHeight w:val="465" w:hRule="atLeast"/>
-        </w:trPr>
-        <w:tc>
-          <w:tcPr>
-            <w:tcW w:w="665" w:type="dxa"/>
-            <w:tcBorders>
-              <w:top w:val="single" w:sz="4" w:space="0" w:color="000000"/>
-              <w:start w:val="single" w:sz="4" w:space="0" w:color="000000"/>
-              <w:bottom w:val="single" w:sz="4" w:space="0" w:color="000000"/>
-              <w:end w:val="single" w:sz="4" w:space="0" w:color="000000"/>
-            </w:tcBorders>
-            <w:vAlign w:val="center"/>
-          </w:tcPr>
-          <w:p>
-            <w:pPr>
-              <w:pStyle w:val="Normal"/>
-              <w:snapToGrid w:val="false"/>
-              <w:jc w:val="center"/>
-              <w:rPr>
-                <w:rFonts w:ascii="宋体" w:hAnsi="宋体" w:eastAsia="宋体" w:cs="宋体" w:hint="eastAsia"/>
-                <w:i w:val="false"/>
-                <w:iCs w:val="false"/>
-                <w:color w:val="000000"/>
-                <w:sz w:val="22"/>
-                <w:szCs w:val="22"/>
-                <w:u w:val="none"/>
-              </w:rPr>
-            </w:pPr>
-            <w:r>
-              <w:rPr>
-                <w:rFonts w:eastAsia="宋体" w:cs="宋体" w:hint="eastAsia" w:ascii="宋体" w:hAnsi="宋体"/>
-                <w:i w:val="false"/>
-                <w:iCs w:val="false"/>
-                <w:color w:val="000000"/>
-                <w:sz w:val="22"/>
-                <w:szCs w:val="22"/>
-                <w:u w:val="none"/>
-              </w:rPr>
-            </w:r>
-          </w:p>
-        </w:tc>
-        <w:tc>
-          <w:tcPr>
-            <w:tcW w:w="2481" w:type="dxa"/>
-            <w:tcBorders>
-              <w:top w:val="single" w:sz="4" w:space="0" w:color="000000"/>
-              <w:start w:val="single" w:sz="4" w:space="0" w:color="000000"/>
-              <w:bottom w:val="single" w:sz="4" w:space="0" w:color="000000"/>
-              <w:end w:val="single" w:sz="4" w:space="0" w:color="000000"/>
-            </w:tcBorders>
-            <w:vAlign w:val="center"/>
-          </w:tcPr>
-          <w:p>
-            <w:pPr>
-              <w:pStyle w:val="Normal"/>
-              <w:snapToGrid w:val="false"/>
-              <w:jc w:val="center"/>
-              <w:rPr>
-                <w:rFonts w:ascii="宋体" w:hAnsi="宋体" w:eastAsia="宋体" w:cs="宋体" w:hint="eastAsia"/>
-                <w:i w:val="false"/>
-                <w:iCs w:val="false"/>
-                <w:color w:val="000000"/>
-                <w:sz w:val="22"/>
-                <w:szCs w:val="22"/>
-                <w:u w:val="none"/>
-              </w:rPr>
-            </w:pPr>
-            <w:r>
-              <w:rPr>
-                <w:rFonts w:eastAsia="宋体" w:cs="宋体" w:hint="eastAsia" w:ascii="宋体" w:hAnsi="宋体"/>
-                <w:i w:val="false"/>
-                <w:iCs w:val="false"/>
-                <w:color w:val="000000"/>
-                <w:sz w:val="22"/>
-                <w:szCs w:val="22"/>
-                <w:u w:val="none"/>
-              </w:rPr>
-            </w:r>
-          </w:p>
-        </w:tc>
-        <w:tc>
-          <w:tcPr>
-            <w:tcW w:w="1294" w:type="dxa"/>
-            <w:tcBorders>
-              <w:top w:val="single" w:sz="4" w:space="0" w:color="000000"/>
-              <w:start w:val="single" w:sz="4" w:space="0" w:color="000000"/>
-              <w:bottom w:val="single" w:sz="4" w:space="0" w:color="000000"/>
-              <w:end w:val="single" w:sz="4" w:space="0" w:color="000000"/>
-            </w:tcBorders>
-            <w:vAlign w:val="center"/>
-          </w:tcPr>
-          <w:p>
-            <w:pPr>
-              <w:pStyle w:val="Normal"/>
-              <w:snapToGrid w:val="false"/>
-              <w:jc w:val="center"/>
-              <w:rPr>
-                <w:rFonts w:ascii="宋体" w:hAnsi="宋体" w:eastAsia="宋体" w:cs="宋体" w:hint="eastAsia"/>
-                <w:i w:val="false"/>
-                <w:iCs w:val="false"/>
-                <w:color w:val="000000"/>
-                <w:sz w:val="22"/>
-                <w:szCs w:val="22"/>
-                <w:u w:val="none"/>
-              </w:rPr>
-            </w:pPr>
-            <w:r>
-              <w:rPr>
-                <w:rFonts w:eastAsia="宋体" w:cs="宋体" w:hint="eastAsia" w:ascii="宋体" w:hAnsi="宋体"/>
-                <w:i w:val="false"/>
-                <w:iCs w:val="false"/>
-                <w:color w:val="000000"/>
-                <w:sz w:val="22"/>
-                <w:szCs w:val="22"/>
-                <w:u w:val="none"/>
-              </w:rPr>
-            </w:r>
-          </w:p>
-        </w:tc>
-        <w:tc>
-          <w:tcPr>
-            <w:tcW w:w="1294" w:type="dxa"/>
-            <w:tcBorders>
-              <w:top w:val="single" w:sz="4" w:space="0" w:color="000000"/>
-              <w:start w:val="single" w:sz="4" w:space="0" w:color="000000"/>
-              <w:bottom w:val="single" w:sz="4" w:space="0" w:color="000000"/>
-              <w:end w:val="single" w:sz="4" w:space="0" w:color="000000"/>
-            </w:tcBorders>
-            <w:vAlign w:val="center"/>
-          </w:tcPr>
-          <w:p>
-            <w:pPr>
-              <w:pStyle w:val="Normal"/>
-              <w:snapToGrid w:val="false"/>
-              <w:jc w:val="center"/>
-              <w:rPr>
-                <w:rFonts w:ascii="宋体" w:hAnsi="宋体" w:eastAsia="宋体" w:cs="宋体" w:hint="eastAsia"/>
-                <w:i w:val="false"/>
-                <w:iCs w:val="false"/>
-                <w:color w:val="000000"/>
-                <w:sz w:val="22"/>
-                <w:szCs w:val="22"/>
-                <w:u w:val="none"/>
-              </w:rPr>
-            </w:pPr>
-            <w:r>
-              <w:rPr>
-                <w:rFonts w:eastAsia="宋体" w:cs="宋体" w:hint="eastAsia" w:ascii="宋体" w:hAnsi="宋体"/>
-                <w:i w:val="false"/>
-                <w:iCs w:val="false"/>
-                <w:color w:val="000000"/>
-                <w:sz w:val="22"/>
-                <w:szCs w:val="22"/>
-                <w:u w:val="none"/>
-              </w:rPr>
-            </w:r>
-          </w:p>
-        </w:tc>
-        <w:tc>
-          <w:tcPr>
-            <w:tcW w:w="1294" w:type="dxa"/>
-            <w:tcBorders>
-              <w:top w:val="single" w:sz="4" w:space="0" w:color="000000"/>
-              <w:start w:val="single" w:sz="4" w:space="0" w:color="000000"/>
-              <w:bottom w:val="single" w:sz="4" w:space="0" w:color="000000"/>
-              <w:end w:val="single" w:sz="4" w:space="0" w:color="000000"/>
-            </w:tcBorders>
-            <w:vAlign w:val="center"/>
-          </w:tcPr>
-          <w:p>
-            <w:pPr>
-              <w:pStyle w:val="Normal"/>
-              <w:snapToGrid w:val="false"/>
-              <w:jc w:val="center"/>
-              <w:rPr>
-                <w:rFonts w:ascii="宋体" w:hAnsi="宋体" w:eastAsia="宋体" w:cs="宋体" w:hint="eastAsia"/>
-                <w:i w:val="false"/>
-                <w:iCs w:val="false"/>
-                <w:color w:val="000000"/>
-                <w:sz w:val="22"/>
-                <w:szCs w:val="22"/>
-                <w:u w:val="none"/>
-              </w:rPr>
-            </w:pPr>
-            <w:r>
-              <w:rPr>
-                <w:rFonts w:eastAsia="宋体" w:cs="宋体" w:hint="eastAsia" w:ascii="宋体" w:hAnsi="宋体"/>
-                <w:i w:val="false"/>
-                <w:iCs w:val="false"/>
-                <w:color w:val="000000"/>
-                <w:sz w:val="22"/>
-                <w:szCs w:val="22"/>
-                <w:u w:val="none"/>
-              </w:rPr>
-            </w:r>
-          </w:p>
-        </w:tc>
-        <w:tc>
-          <w:tcPr>
-            <w:tcW w:w="1294" w:type="dxa"/>
-            <w:tcBorders>
-              <w:top w:val="single" w:sz="4" w:space="0" w:color="000000"/>
-              <w:start w:val="single" w:sz="4" w:space="0" w:color="000000"/>
-              <w:bottom w:val="single" w:sz="4" w:space="0" w:color="000000"/>
-              <w:end w:val="single" w:sz="4" w:space="0" w:color="000000"/>
-            </w:tcBorders>
-            <w:vAlign w:val="center"/>
-          </w:tcPr>
-          <w:p>
-            <w:pPr>
-              <w:pStyle w:val="Normal"/>
-              <w:snapToGrid w:val="false"/>
-              <w:jc w:val="center"/>
-              <w:rPr>
-                <w:rFonts w:ascii="宋体" w:hAnsi="宋体" w:eastAsia="宋体" w:cs="宋体" w:hint="eastAsia"/>
-                <w:i w:val="false"/>
-                <w:iCs w:val="false"/>
-                <w:color w:val="000000"/>
-                <w:sz w:val="22"/>
-                <w:szCs w:val="22"/>
-                <w:u w:val="none"/>
-              </w:rPr>
-            </w:pPr>
-            <w:r>
-              <w:rPr>
-                <w:rFonts w:eastAsia="宋体" w:cs="宋体" w:hint="eastAsia" w:ascii="宋体" w:hAnsi="宋体"/>
-                <w:i w:val="false"/>
-                <w:iCs w:val="false"/>
-                <w:color w:val="000000"/>
-                <w:sz w:val="22"/>
-                <w:szCs w:val="22"/>
-                <w:u w:val="none"/>
-              </w:rPr>
-            </w:r>
-          </w:p>
-        </w:tc>
-        <w:tc>
-          <w:tcPr>
-            <w:tcW w:w="1298" w:type="dxa"/>
-            <w:tcBorders>
-              <w:top w:val="single" w:sz="4" w:space="0" w:color="000000"/>
-              <w:start w:val="single" w:sz="4" w:space="0" w:color="000000"/>
-              <w:bottom w:val="single" w:sz="4" w:space="0" w:color="000000"/>
-              <w:end w:val="single" w:sz="4" w:space="0" w:color="000000"/>
-            </w:tcBorders>
-            <w:vAlign w:val="center"/>
-          </w:tcPr>
-          <w:p>
-            <w:pPr>
-              <w:pStyle w:val="Normal"/>
-              <w:snapToGrid w:val="false"/>
-              <w:jc w:val="center"/>
-              <w:rPr>
-                <w:rFonts w:ascii="宋体" w:hAnsi="宋体" w:eastAsia="宋体" w:cs="宋体" w:hint="eastAsia"/>
-                <w:i w:val="false"/>
-                <w:iCs w:val="false"/>
-                <w:color w:val="000000"/>
-                <w:sz w:val="22"/>
-                <w:szCs w:val="22"/>
-                <w:u w:val="none"/>
-              </w:rPr>
-            </w:pPr>
-            <w:r>
-              <w:rPr>
-                <w:rFonts w:eastAsia="宋体" w:cs="宋体" w:hint="eastAsia" w:ascii="宋体" w:hAnsi="宋体"/>
-                <w:i w:val="false"/>
-                <w:iCs w:val="false"/>
-                <w:color w:val="000000"/>
-                <w:sz w:val="22"/>
-                <w:szCs w:val="22"/>
-                <w:u w:val="none"/>
-              </w:rPr>
-            </w:r>
-          </w:p>
-        </w:tc>
-      </w:tr>
-      <w:tr>
-        <w:trPr>
-          <w:trHeight w:val="465" w:hRule="atLeast"/>
-        </w:trPr>
-        <w:tc>
-          <w:tcPr>
-            <w:tcW w:w="665" w:type="dxa"/>
-            <w:tcBorders>
-              <w:top w:val="single" w:sz="4" w:space="0" w:color="000000"/>
-              <w:start w:val="single" w:sz="4" w:space="0" w:color="000000"/>
-              <w:bottom w:val="single" w:sz="4" w:space="0" w:color="000000"/>
-              <w:end w:val="single" w:sz="4" w:space="0" w:color="000000"/>
-            </w:tcBorders>
-            <w:vAlign w:val="center"/>
-          </w:tcPr>
-          <w:p>
-            <w:pPr>
-              <w:pStyle w:val="Normal"/>
-              <w:snapToGrid w:val="false"/>
-              <w:jc w:val="center"/>
-              <w:rPr>
-                <w:rFonts w:ascii="宋体" w:hAnsi="宋体" w:eastAsia="宋体" w:cs="宋体" w:hint="eastAsia"/>
-                <w:i w:val="false"/>
-                <w:iCs w:val="false"/>
-                <w:color w:val="000000"/>
-                <w:sz w:val="22"/>
-                <w:szCs w:val="22"/>
-                <w:u w:val="none"/>
-              </w:rPr>
-            </w:pPr>
-            <w:r>
-              <w:rPr>
-                <w:rFonts w:eastAsia="宋体" w:cs="宋体" w:hint="eastAsia" w:ascii="宋体" w:hAnsi="宋体"/>
-                <w:i w:val="false"/>
-                <w:iCs w:val="false"/>
-                <w:color w:val="000000"/>
-                <w:sz w:val="22"/>
-                <w:szCs w:val="22"/>
-                <w:u w:val="none"/>
-              </w:rPr>
-            </w:r>
-          </w:p>
-        </w:tc>
-        <w:tc>
-          <w:tcPr>
-            <w:tcW w:w="2481" w:type="dxa"/>
-            <w:tcBorders>
-              <w:top w:val="single" w:sz="4" w:space="0" w:color="000000"/>
-              <w:start w:val="single" w:sz="4" w:space="0" w:color="000000"/>
-              <w:bottom w:val="single" w:sz="4" w:space="0" w:color="000000"/>
-              <w:end w:val="single" w:sz="4" w:space="0" w:color="000000"/>
-            </w:tcBorders>
-            <w:vAlign w:val="center"/>
-          </w:tcPr>
-          <w:p>
-            <w:pPr>
-              <w:pStyle w:val="Normal"/>
-              <w:snapToGrid w:val="false"/>
-              <w:jc w:val="center"/>
-              <w:rPr>
-                <w:rFonts w:ascii="宋体" w:hAnsi="宋体" w:eastAsia="宋体" w:cs="宋体" w:hint="eastAsia"/>
-                <w:i w:val="false"/>
-                <w:iCs w:val="false"/>
-                <w:color w:val="000000"/>
-                <w:sz w:val="22"/>
-                <w:szCs w:val="22"/>
-                <w:u w:val="none"/>
-              </w:rPr>
-            </w:pPr>
-            <w:r>
-              <w:rPr>
-                <w:rFonts w:eastAsia="宋体" w:cs="宋体" w:hint="eastAsia" w:ascii="宋体" w:hAnsi="宋体"/>
-                <w:i w:val="false"/>
-                <w:iCs w:val="false"/>
-                <w:color w:val="000000"/>
-                <w:sz w:val="22"/>
-                <w:szCs w:val="22"/>
-                <w:u w:val="none"/>
-              </w:rPr>
-            </w:r>
-          </w:p>
-        </w:tc>
-        <w:tc>
-          <w:tcPr>
-            <w:tcW w:w="1294" w:type="dxa"/>
-            <w:tcBorders>
-              <w:top w:val="single" w:sz="4" w:space="0" w:color="000000"/>
-              <w:start w:val="single" w:sz="4" w:space="0" w:color="000000"/>
-              <w:bottom w:val="single" w:sz="4" w:space="0" w:color="000000"/>
-              <w:end w:val="single" w:sz="4" w:space="0" w:color="000000"/>
-            </w:tcBorders>
-            <w:vAlign w:val="center"/>
-          </w:tcPr>
-          <w:p>
-            <w:pPr>
-              <w:pStyle w:val="Normal"/>
-              <w:snapToGrid w:val="false"/>
-              <w:jc w:val="center"/>
-              <w:rPr>
-                <w:rFonts w:ascii="宋体" w:hAnsi="宋体" w:eastAsia="宋体" w:cs="宋体" w:hint="eastAsia"/>
-                <w:i w:val="false"/>
-                <w:iCs w:val="false"/>
-                <w:color w:val="000000"/>
-                <w:sz w:val="22"/>
-                <w:szCs w:val="22"/>
-                <w:u w:val="none"/>
-              </w:rPr>
-            </w:pPr>
-            <w:r>
-              <w:rPr>
-                <w:rFonts w:eastAsia="宋体" w:cs="宋体" w:hint="eastAsia" w:ascii="宋体" w:hAnsi="宋体"/>
-                <w:i w:val="false"/>
-                <w:iCs w:val="false"/>
-                <w:color w:val="000000"/>
-                <w:sz w:val="22"/>
-                <w:szCs w:val="22"/>
-                <w:u w:val="none"/>
-              </w:rPr>
-            </w:r>
-          </w:p>
-        </w:tc>
-        <w:tc>
-          <w:tcPr>
-            <w:tcW w:w="1294" w:type="dxa"/>
-            <w:tcBorders>
-              <w:top w:val="single" w:sz="4" w:space="0" w:color="000000"/>
-              <w:start w:val="single" w:sz="4" w:space="0" w:color="000000"/>
-              <w:bottom w:val="single" w:sz="4" w:space="0" w:color="000000"/>
-              <w:end w:val="single" w:sz="4" w:space="0" w:color="000000"/>
-            </w:tcBorders>
-            <w:vAlign w:val="center"/>
-          </w:tcPr>
-          <w:p>
-            <w:pPr>
-              <w:pStyle w:val="Normal"/>
-              <w:snapToGrid w:val="false"/>
-              <w:jc w:val="center"/>
-              <w:rPr>
-                <w:rFonts w:ascii="宋体" w:hAnsi="宋体" w:eastAsia="宋体" w:cs="宋体" w:hint="eastAsia"/>
-                <w:i w:val="false"/>
-                <w:iCs w:val="false"/>
-                <w:color w:val="000000"/>
-                <w:sz w:val="22"/>
-                <w:szCs w:val="22"/>
-                <w:u w:val="none"/>
-              </w:rPr>
-            </w:pPr>
-            <w:r>
-              <w:rPr>
-                <w:rFonts w:eastAsia="宋体" w:cs="宋体" w:hint="eastAsia" w:ascii="宋体" w:hAnsi="宋体"/>
-                <w:i w:val="false"/>
-                <w:iCs w:val="false"/>
-                <w:color w:val="000000"/>
-                <w:sz w:val="22"/>
-                <w:szCs w:val="22"/>
-                <w:u w:val="none"/>
-              </w:rPr>
-            </w:r>
-          </w:p>
-        </w:tc>
-        <w:tc>
-          <w:tcPr>
-            <w:tcW w:w="1294" w:type="dxa"/>
-            <w:tcBorders>
-              <w:top w:val="single" w:sz="4" w:space="0" w:color="000000"/>
-              <w:start w:val="single" w:sz="4" w:space="0" w:color="000000"/>
-              <w:bottom w:val="single" w:sz="4" w:space="0" w:color="000000"/>
-              <w:end w:val="single" w:sz="4" w:space="0" w:color="000000"/>
-            </w:tcBorders>
-            <w:vAlign w:val="center"/>
-          </w:tcPr>
-          <w:p>
-            <w:pPr>
-              <w:pStyle w:val="Normal"/>
-              <w:snapToGrid w:val="false"/>
-              <w:jc w:val="center"/>
-              <w:rPr>
-                <w:rFonts w:ascii="宋体" w:hAnsi="宋体" w:eastAsia="宋体" w:cs="宋体" w:hint="eastAsia"/>
-                <w:i w:val="false"/>
-                <w:iCs w:val="false"/>
-                <w:color w:val="000000"/>
-                <w:sz w:val="22"/>
-                <w:szCs w:val="22"/>
-                <w:u w:val="none"/>
-              </w:rPr>
-            </w:pPr>
-            <w:r>
-              <w:rPr>
-                <w:rFonts w:eastAsia="宋体" w:cs="宋体" w:hint="eastAsia" w:ascii="宋体" w:hAnsi="宋体"/>
-                <w:i w:val="false"/>
-                <w:iCs w:val="false"/>
-                <w:color w:val="000000"/>
-                <w:sz w:val="22"/>
-                <w:szCs w:val="22"/>
-                <w:u w:val="none"/>
-              </w:rPr>
-            </w:r>
-          </w:p>
-        </w:tc>
-        <w:tc>
-          <w:tcPr>
-            <w:tcW w:w="1294" w:type="dxa"/>
-            <w:tcBorders>
-              <w:top w:val="single" w:sz="4" w:space="0" w:color="000000"/>
-              <w:start w:val="single" w:sz="4" w:space="0" w:color="000000"/>
-              <w:bottom w:val="single" w:sz="4" w:space="0" w:color="000000"/>
-              <w:end w:val="single" w:sz="4" w:space="0" w:color="000000"/>
-            </w:tcBorders>
-            <w:vAlign w:val="center"/>
-          </w:tcPr>
-          <w:p>
-            <w:pPr>
-              <w:pStyle w:val="Normal"/>
-              <w:snapToGrid w:val="false"/>
-              <w:jc w:val="center"/>
-              <w:rPr>
-                <w:rFonts w:ascii="宋体" w:hAnsi="宋体" w:eastAsia="宋体" w:cs="宋体" w:hint="eastAsia"/>
-                <w:i w:val="false"/>
-                <w:iCs w:val="false"/>
-                <w:color w:val="000000"/>
-                <w:sz w:val="22"/>
-                <w:szCs w:val="22"/>
-                <w:u w:val="none"/>
-              </w:rPr>
-            </w:pPr>
-            <w:r>
-              <w:rPr>
-                <w:rFonts w:eastAsia="宋体" w:cs="宋体" w:hint="eastAsia" w:ascii="宋体" w:hAnsi="宋体"/>
-                <w:i w:val="false"/>
-                <w:iCs w:val="false"/>
-                <w:color w:val="000000"/>
-                <w:sz w:val="22"/>
-                <w:szCs w:val="22"/>
-                <w:u w:val="none"/>
-              </w:rPr>
-            </w:r>
-          </w:p>
-        </w:tc>
-        <w:tc>
-          <w:tcPr>
-            <w:tcW w:w="1298" w:type="dxa"/>
-            <w:tcBorders>
-              <w:top w:val="single" w:sz="4" w:space="0" w:color="000000"/>
-              <w:start w:val="single" w:sz="4" w:space="0" w:color="000000"/>
-              <w:bottom w:val="single" w:sz="4" w:space="0" w:color="000000"/>
-              <w:end w:val="single" w:sz="4" w:space="0" w:color="000000"/>
-            </w:tcBorders>
-            <w:vAlign w:val="center"/>
-          </w:tcPr>
-          <w:p>
-            <w:pPr>
-              <w:pStyle w:val="Normal"/>
-              <w:snapToGrid w:val="false"/>
-              <w:jc w:val="center"/>
-              <w:rPr>
-                <w:rFonts w:ascii="宋体" w:hAnsi="宋体" w:eastAsia="宋体" w:cs="宋体" w:hint="eastAsia"/>
-                <w:i w:val="false"/>
-                <w:iCs w:val="false"/>
-                <w:color w:val="000000"/>
-                <w:sz w:val="22"/>
-                <w:szCs w:val="22"/>
-                <w:u w:val="none"/>
-              </w:rPr>
-            </w:pPr>
-            <w:r>
-              <w:rPr>
-                <w:rFonts w:eastAsia="宋体" w:cs="宋体" w:hint="eastAsia" w:ascii="宋体" w:hAnsi="宋体"/>
-                <w:i w:val="false"/>
-                <w:iCs w:val="false"/>
-                <w:color w:val="000000"/>
-                <w:sz w:val="22"/>
-                <w:szCs w:val="22"/>
-                <w:u w:val="none"/>
-              </w:rPr>
-            </w:r>
-          </w:p>
-        </w:tc>
-      </w:tr>
-      <w:tr>
-        <w:trPr>
-          <w:trHeight w:val="475" w:hRule="atLeast"/>
-        </w:trPr>
-        <w:tc>
-          <w:tcPr>
-            <w:tcW w:w="7028" w:type="dxa"/>
-            <w:gridSpan w:val="5"/>
-            <w:tcBorders>
-              <w:top w:val="single" w:sz="4" w:space="0" w:color="000000"/>
-              <w:start w:val="single" w:sz="4" w:space="0" w:color="000000"/>
-              <w:bottom w:val="single" w:sz="4" w:space="0" w:color="000000"/>
-              <w:end w:val="single" w:sz="4" w:space="0" w:color="000000"/>
-            </w:tcBorders>
-            <w:vAlign w:val="center"/>
-          </w:tcPr>
-          <w:p>
-            <w:pPr>
-              <w:pStyle w:val="Normal"/>
-              <w:keepNext w:val="false"/>
-              <w:keepLines w:val="false"/>
-              <w:widowControl/>
-              <w:suppressLineNumbers w:val="0"/>
-              <w:jc w:val="center"/>
-              <w:textAlignment w:val="center"/>
-              <w:rPr>
-                <w:rFonts w:ascii="宋体" w:hAnsi="宋体" w:eastAsia="宋体" w:cs="宋体" w:hint="eastAsia"/>
-                <w:i w:val="false"/>
-                <w:iCs w:val="false"/>
-                <w:color w:val="000000"/>
-                <w:sz w:val="22"/>
-                <w:szCs w:val="22"/>
-                <w:u w:val="none"/>
-              </w:rPr>
-            </w:pPr>
-            <w:r>
-              <w:rPr>
-                <w:rFonts w:ascii="宋体" w:hAnsi="宋体" w:cs="宋体" w:hint="eastAsia"/>
-                <w:i w:val="false"/>
-                <w:iCs w:val="false"/>
-                <w:color w:val="000000"/>
-                <w:kern w:val="0"/>
-                <w:sz w:val="22"/>
-                <w:szCs w:val="22"/>
-                <w:u w:val="none"/>
-                <w:lang w:bidi="ar"/>
-              </w:rPr>
-              <w:t>合计</w:t>
-            </w:r>
-          </w:p>
-        </w:tc>
-        <w:tc>
-          <w:tcPr>
-            <w:tcW w:w="1294" w:type="dxa"/>
-            <w:tcBorders>
-              <w:top w:val="single" w:sz="4" w:space="0" w:color="000000"/>
-              <w:start w:val="single" w:sz="4" w:space="0" w:color="000000"/>
-              <w:bottom w:val="single" w:sz="4" w:space="0" w:color="000000"/>
-              <w:end w:val="single" w:sz="4" w:space="0" w:color="000000"/>
-            </w:tcBorders>
-            <w:vAlign w:val="center"/>
-          </w:tcPr>
-          <w:p>
-            <w:pPr>
-              <w:pStyle w:val="Normal"/>
-              <w:keepNext w:val="false"/>
-              <w:keepLines w:val="false"/>
-              <w:widowControl/>
-              <w:suppressLineNumbers w:val="0"/>
-              <w:snapToGrid w:val="false"/>
-              <w:jc w:val="center"/>
-              <w:textAlignment w:val="center"/>
-              <w:rPr>
-                <w:rFonts w:ascii="宋体" w:hAnsi="宋体" w:eastAsia="宋体" w:cs="宋体" w:hint="eastAsia"/>
-                <w:i w:val="false"/>
-                <w:iCs w:val="false"/>
-                <w:color w:val="000000"/>
-                <w:sz w:val="22"/>
-                <w:szCs w:val="22"/>
-                <w:u w:val="none"/>
-              </w:rPr>
-            </w:pPr>
-            <w:r>
-              <w:rPr>
-                <w:rFonts w:eastAsia="宋体" w:cs="宋体" w:hint="eastAsia" w:ascii="宋体" w:hAnsi="宋体"/>
-                <w:i w:val="false"/>
-                <w:iCs w:val="false"/>
-                <w:color w:val="000000"/>
-                <w:sz w:val="22"/>
-                <w:szCs w:val="22"/>
-                <w:u w:val="none"/>
-              </w:rPr>
-            </w:r>
-          </w:p>
-        </w:tc>
-        <w:tc>
-          <w:tcPr>
-            <w:tcW w:w="1298" w:type="dxa"/>
-            <w:tcBorders>
-              <w:top w:val="single" w:sz="4" w:space="0" w:color="000000"/>
-              <w:start w:val="single" w:sz="4" w:space="0" w:color="000000"/>
-              <w:bottom w:val="single" w:sz="4" w:space="0" w:color="000000"/>
-              <w:end w:val="single" w:sz="4" w:space="0" w:color="000000"/>
-            </w:tcBorders>
-            <w:vAlign w:val="center"/>
-          </w:tcPr>
-          <w:p>
-            <w:pPr>
-              <w:pStyle w:val="Normal"/>
-              <w:snapToGrid w:val="false"/>
-              <w:jc w:val="center"/>
-              <w:rPr>
-                <w:rFonts w:ascii="宋体" w:hAnsi="宋体" w:eastAsia="宋体" w:cs="宋体" w:hint="eastAsia"/>
-                <w:i w:val="false"/>
-                <w:iCs w:val="false"/>
-                <w:color w:val="000000"/>
-                <w:sz w:val="22"/>
-                <w:szCs w:val="22"/>
-                <w:u w:val="none"/>
-              </w:rPr>
-            </w:pPr>
-            <w:r>
-              <w:rPr>
-                <w:rFonts w:eastAsia="宋体" w:cs="宋体" w:hint="eastAsia" w:ascii="宋体" w:hAnsi="宋体"/>
-                <w:i w:val="false"/>
-                <w:iCs w:val="false"/>
-                <w:color w:val="000000"/>
-                <w:sz w:val="22"/>
-                <w:szCs w:val="22"/>
-                <w:u w:val="none"/>
-              </w:rPr>
+              <w:t xml:space="preserve">{remark}</w:t>
             </w:r>
           </w:p>
         </w:tc>
       </w:tr>
     </w:tbl>
+    <w:p>
+      <w:r>
+        <w:t xml:space="preserve">{/bill.laborItems}</w:t>
+      </w:r>
+    </w:p>
     <w:p>
       <w:pPr>
         <w:pStyle w:val="Style13"/>
@@ -10683,8 +7569,8 @@
       </w:r>
     </w:p>
     <w:sectPr>
-      <w:headerReference w:type="default" r:id="rId2"/>
-      <w:footerReference w:type="default" r:id="rId3"/>
+      <w:headerReference w:type="default" r:id="rIdContractWatermarkHeader"/>
+      <w:footerReference w:type="default" r:id="rIdContractTemplateFooter"/>
       <w:type w:val="nextPage"/>
       <w:pgSz w:orient="landscape" w:w="11906" w:h="16838"/>
       <w:pgMar w:left="1080" w:right="1080" w:gutter="0" w:header="851" w:top="1157" w:footer="992" w:bottom="1157"/>
@@ -10695,6 +7581,19 @@
     </w:sectPr>
   </w:body>
 </w:document>
+</file>
+
+<file path=word/footer-contract-template.xml><?xml version="1.0" encoding="utf-8"?>
+<w:ftr xmlns:w="http://schemas.openxmlformats.org/wordprocessingml/2006/main">
+  <w:p>
+    <w:pPr>
+      <w:jc w:val="center"/>
+    </w:pPr>
+    <w:r>
+      <w:t xml:space="preserve">合同正文</w:t>
+    </w:r>
+  </w:p>
+</w:ftr>
 </file>
 
 <file path=word/footer1.xml><?xml version="1.0" encoding="utf-8"?>
@@ -10936,6 +7835,19 @@
     </w:r>
   </w:p>
 </w:ftr>
+</file>
+
+<file path=word/header-contract-watermark.xml><?xml version="1.0" encoding="utf-8"?>
+<w:hdr xmlns:w="http://schemas.openxmlformats.org/wordprocessingml/2006/main">
+  <w:p>
+    <w:pPr>
+      <w:jc w:val="center"/>
+    </w:pPr>
+    <w:r>
+      <w:t xml:space="preserve">{document.watermark}</w:t>
+    </w:r>
+  </w:p>
+</w:hdr>
 </file>
 
 <file path=word/header1.xml><?xml version="1.0" encoding="utf-8"?>

</xml_diff>